<commit_message>
atualiza plano de ensino para 2026.2 e novo sistema de recuperação
Período letivo atualizado para 2026.2. Sistema de recuperação
reformulado conforme Instrução Normativa nº 006/2026 (extinção dos
exames finais): avaliação complementar única ao final do semestre,
aplicada sobre a média geral e restrita a quem não atingir 6,0.
</commit_message>
<xml_diff>
--- a/33MQEI - Plano de ensino.docx
+++ b/33MQEI - Plano de ensino.docx
@@ -39,7 +39,27 @@
           <w:sz w:val="22"/>
           <w:szCs w:val="22"/>
         </w:rPr>
-        <w:t>Centro de Ciências da Administração e Socio-Econômicas – ESAG</w:t>
+        <w:t xml:space="preserve">Centro de Ciências da Administração e </w:t>
+      </w:r>
+      <w:proofErr w:type="spellStart"/>
+      <w:r>
+        <w:rPr>
+          <w:rStyle w:val="txtarial10ptblack"/>
+          <w:b/>
+          <w:sz w:val="22"/>
+          <w:szCs w:val="22"/>
+        </w:rPr>
+        <w:t>Socio-Econômicas</w:t>
+      </w:r>
+      <w:proofErr w:type="spellEnd"/>
+      <w:r>
+        <w:rPr>
+          <w:rStyle w:val="txtarial10ptblack"/>
+          <w:b/>
+          <w:sz w:val="22"/>
+          <w:szCs w:val="22"/>
+        </w:rPr>
+        <w:t xml:space="preserve"> – ESAG</w:t>
       </w:r>
     </w:p>
     <w:p>
@@ -560,7 +580,7 @@
                 <w:sz w:val="22"/>
                 <w:szCs w:val="22"/>
               </w:rPr>
-              <w:t>1</w:t>
+              <w:t>2</w:t>
             </w:r>
           </w:p>
         </w:tc>
@@ -1192,7 +1212,47 @@
                 <w:sz w:val="22"/>
                 <w:szCs w:val="22"/>
               </w:rPr>
-              <w:t>, Chiang e Wainwright (caps. 1 e 2)</w:t>
+              <w:t xml:space="preserve">, </w:t>
+            </w:r>
+            <w:proofErr w:type="spellStart"/>
+            <w:r>
+              <w:rPr>
+                <w:rFonts w:eastAsia="Arial Unicode MS"/>
+                <w:color w:val="000000"/>
+                <w:sz w:val="22"/>
+                <w:szCs w:val="22"/>
+              </w:rPr>
+              <w:t>Chiang</w:t>
+            </w:r>
+            <w:proofErr w:type="spellEnd"/>
+            <w:r>
+              <w:rPr>
+                <w:rFonts w:eastAsia="Arial Unicode MS"/>
+                <w:color w:val="000000"/>
+                <w:sz w:val="22"/>
+                <w:szCs w:val="22"/>
+              </w:rPr>
+              <w:t xml:space="preserve"> e </w:t>
+            </w:r>
+            <w:proofErr w:type="spellStart"/>
+            <w:r>
+              <w:rPr>
+                <w:rFonts w:eastAsia="Arial Unicode MS"/>
+                <w:color w:val="000000"/>
+                <w:sz w:val="22"/>
+                <w:szCs w:val="22"/>
+              </w:rPr>
+              <w:t>Wainwright</w:t>
+            </w:r>
+            <w:proofErr w:type="spellEnd"/>
+            <w:r>
+              <w:rPr>
+                <w:rFonts w:eastAsia="Arial Unicode MS"/>
+                <w:color w:val="000000"/>
+                <w:sz w:val="22"/>
+                <w:szCs w:val="22"/>
+              </w:rPr>
+              <w:t xml:space="preserve"> (caps. 1 e 2)</w:t>
             </w:r>
             <w:r>
               <w:rPr>
@@ -1223,14 +1283,25 @@
               </w:rPr>
               <w:t xml:space="preserve">Leitura complementar: </w:t>
             </w:r>
-            <w:r>
-              <w:rPr>
-                <w:rFonts w:eastAsia="Arial Unicode MS"/>
-                <w:color w:val="000000"/>
-                <w:sz w:val="22"/>
-                <w:szCs w:val="22"/>
-              </w:rPr>
-              <w:t>Hoy et al. (cap. 1)</w:t>
+            <w:proofErr w:type="spellStart"/>
+            <w:r>
+              <w:rPr>
+                <w:rFonts w:eastAsia="Arial Unicode MS"/>
+                <w:color w:val="000000"/>
+                <w:sz w:val="22"/>
+                <w:szCs w:val="22"/>
+              </w:rPr>
+              <w:t>Hoy</w:t>
+            </w:r>
+            <w:proofErr w:type="spellEnd"/>
+            <w:r>
+              <w:rPr>
+                <w:rFonts w:eastAsia="Arial Unicode MS"/>
+                <w:color w:val="000000"/>
+                <w:sz w:val="22"/>
+                <w:szCs w:val="22"/>
+              </w:rPr>
+              <w:t xml:space="preserve"> et al. (cap. 1)</w:t>
             </w:r>
           </w:p>
           <w:p>
@@ -1254,7 +1325,27 @@
                 <w:sz w:val="22"/>
                 <w:szCs w:val="22"/>
               </w:rPr>
-              <w:t xml:space="preserve">Revisão de cálculo univariado </w:t>
+              <w:t xml:space="preserve">Revisão de cálculo </w:t>
+            </w:r>
+            <w:proofErr w:type="spellStart"/>
+            <w:r>
+              <w:rPr>
+                <w:rFonts w:eastAsia="Arial Unicode MS"/>
+                <w:color w:val="000000"/>
+                <w:sz w:val="22"/>
+                <w:szCs w:val="22"/>
+              </w:rPr>
+              <w:t>univariado</w:t>
+            </w:r>
+            <w:proofErr w:type="spellEnd"/>
+            <w:r>
+              <w:rPr>
+                <w:rFonts w:eastAsia="Arial Unicode MS"/>
+                <w:color w:val="000000"/>
+                <w:sz w:val="22"/>
+                <w:szCs w:val="22"/>
+              </w:rPr>
+              <w:t xml:space="preserve"> </w:t>
             </w:r>
           </w:p>
           <w:p>
@@ -1276,6 +1367,7 @@
               </w:rPr>
               <w:t xml:space="preserve">Leitura básica: </w:t>
             </w:r>
+            <w:proofErr w:type="spellStart"/>
             <w:r>
               <w:rPr>
                 <w:rFonts w:eastAsia="Arial Unicode MS"/>
@@ -1285,6 +1377,7 @@
               </w:rPr>
               <w:t>Chiang</w:t>
             </w:r>
+            <w:proofErr w:type="spellEnd"/>
             <w:r>
               <w:rPr>
                 <w:rFonts w:eastAsia="Arial Unicode MS"/>
@@ -1301,7 +1394,27 @@
                 <w:sz w:val="22"/>
                 <w:szCs w:val="22"/>
               </w:rPr>
-              <w:t xml:space="preserve">e Wainwright </w:t>
+              <w:t xml:space="preserve">e </w:t>
+            </w:r>
+            <w:proofErr w:type="spellStart"/>
+            <w:r>
+              <w:rPr>
+                <w:rFonts w:eastAsia="Arial Unicode MS"/>
+                <w:color w:val="000000"/>
+                <w:sz w:val="22"/>
+                <w:szCs w:val="22"/>
+              </w:rPr>
+              <w:t>Wainwright</w:t>
+            </w:r>
+            <w:proofErr w:type="spellEnd"/>
+            <w:r>
+              <w:rPr>
+                <w:rFonts w:eastAsia="Arial Unicode MS"/>
+                <w:color w:val="000000"/>
+                <w:sz w:val="22"/>
+                <w:szCs w:val="22"/>
+              </w:rPr>
+              <w:t xml:space="preserve"> </w:t>
             </w:r>
             <w:r>
               <w:rPr>
@@ -1368,24 +1481,46 @@
               </w:rPr>
               <w:t xml:space="preserve">Leitura complementar: </w:t>
             </w:r>
-            <w:r>
-              <w:rPr>
-                <w:rFonts w:eastAsia="Arial Unicode MS"/>
-                <w:color w:val="000000"/>
-                <w:sz w:val="22"/>
-                <w:szCs w:val="22"/>
-              </w:rPr>
-              <w:t xml:space="preserve">Hoy et al. (caps. 4 e 5), </w:t>
-            </w:r>
-            <w:r>
-              <w:rPr>
-                <w:rFonts w:eastAsia="Arial Unicode MS"/>
-                <w:color w:val="000000"/>
-                <w:sz w:val="22"/>
-                <w:szCs w:val="22"/>
-              </w:rPr>
-              <w:t>Simon e Blume</w:t>
-            </w:r>
+            <w:proofErr w:type="spellStart"/>
+            <w:r>
+              <w:rPr>
+                <w:rFonts w:eastAsia="Arial Unicode MS"/>
+                <w:color w:val="000000"/>
+                <w:sz w:val="22"/>
+                <w:szCs w:val="22"/>
+              </w:rPr>
+              <w:t>Hoy</w:t>
+            </w:r>
+            <w:proofErr w:type="spellEnd"/>
+            <w:r>
+              <w:rPr>
+                <w:rFonts w:eastAsia="Arial Unicode MS"/>
+                <w:color w:val="000000"/>
+                <w:sz w:val="22"/>
+                <w:szCs w:val="22"/>
+              </w:rPr>
+              <w:t xml:space="preserve"> et al. (caps. 4 e 5), </w:t>
+            </w:r>
+            <w:r>
+              <w:rPr>
+                <w:rFonts w:eastAsia="Arial Unicode MS"/>
+                <w:color w:val="000000"/>
+                <w:sz w:val="22"/>
+                <w:szCs w:val="22"/>
+              </w:rPr>
+              <w:t xml:space="preserve">Simon e </w:t>
+            </w:r>
+            <w:proofErr w:type="spellStart"/>
+            <w:r>
+              <w:rPr>
+                <w:rFonts w:eastAsia="Arial Unicode MS"/>
+                <w:color w:val="000000"/>
+                <w:sz w:val="22"/>
+                <w:szCs w:val="22"/>
+              </w:rPr>
+              <w:t>Blume</w:t>
+            </w:r>
+            <w:proofErr w:type="spellEnd"/>
             <w:r>
               <w:rPr>
                 <w:rFonts w:eastAsia="Arial Unicode MS"/>
@@ -1583,16 +1718,56 @@
                 <w:sz w:val="22"/>
                 <w:szCs w:val="22"/>
               </w:rPr>
-              <w:t xml:space="preserve">), Chiang </w:t>
-            </w:r>
-            <w:r>
-              <w:rPr>
-                <w:rFonts w:eastAsia="Arial Unicode MS"/>
-                <w:color w:val="000000"/>
-                <w:sz w:val="22"/>
-                <w:szCs w:val="22"/>
-              </w:rPr>
-              <w:t xml:space="preserve">e Wainwright </w:t>
+              <w:t xml:space="preserve">), </w:t>
+            </w:r>
+            <w:proofErr w:type="spellStart"/>
+            <w:r>
+              <w:rPr>
+                <w:rFonts w:eastAsia="Arial Unicode MS"/>
+                <w:color w:val="000000"/>
+                <w:sz w:val="22"/>
+                <w:szCs w:val="22"/>
+              </w:rPr>
+              <w:t>Chiang</w:t>
+            </w:r>
+            <w:proofErr w:type="spellEnd"/>
+            <w:r>
+              <w:rPr>
+                <w:rFonts w:eastAsia="Arial Unicode MS"/>
+                <w:color w:val="000000"/>
+                <w:sz w:val="22"/>
+                <w:szCs w:val="22"/>
+              </w:rPr>
+              <w:t xml:space="preserve"> </w:t>
+            </w:r>
+            <w:r>
+              <w:rPr>
+                <w:rFonts w:eastAsia="Arial Unicode MS"/>
+                <w:color w:val="000000"/>
+                <w:sz w:val="22"/>
+                <w:szCs w:val="22"/>
+              </w:rPr>
+              <w:t xml:space="preserve">e </w:t>
+            </w:r>
+            <w:proofErr w:type="spellStart"/>
+            <w:r>
+              <w:rPr>
+                <w:rFonts w:eastAsia="Arial Unicode MS"/>
+                <w:color w:val="000000"/>
+                <w:sz w:val="22"/>
+                <w:szCs w:val="22"/>
+              </w:rPr>
+              <w:t>Wainwright</w:t>
+            </w:r>
+            <w:proofErr w:type="spellEnd"/>
+            <w:r>
+              <w:rPr>
+                <w:rFonts w:eastAsia="Arial Unicode MS"/>
+                <w:color w:val="000000"/>
+                <w:sz w:val="22"/>
+                <w:szCs w:val="22"/>
+              </w:rPr>
+              <w:t xml:space="preserve"> </w:t>
             </w:r>
             <w:r>
               <w:rPr>
@@ -1675,7 +1850,27 @@
                 <w:sz w:val="22"/>
                 <w:szCs w:val="22"/>
               </w:rPr>
-              <w:t>Simon e Blume (cap</w:t>
+              <w:t xml:space="preserve">Simon e </w:t>
+            </w:r>
+            <w:proofErr w:type="spellStart"/>
+            <w:r>
+              <w:rPr>
+                <w:rFonts w:eastAsia="Arial Unicode MS"/>
+                <w:color w:val="000000"/>
+                <w:sz w:val="22"/>
+                <w:szCs w:val="22"/>
+              </w:rPr>
+              <w:t>Blume</w:t>
+            </w:r>
+            <w:proofErr w:type="spellEnd"/>
+            <w:r>
+              <w:rPr>
+                <w:rFonts w:eastAsia="Arial Unicode MS"/>
+                <w:color w:val="000000"/>
+                <w:sz w:val="22"/>
+                <w:szCs w:val="22"/>
+              </w:rPr>
+              <w:t xml:space="preserve"> (cap</w:t>
             </w:r>
             <w:r>
               <w:rPr>
@@ -1818,16 +2013,56 @@
                 <w:sz w:val="22"/>
                 <w:szCs w:val="22"/>
               </w:rPr>
-              <w:t xml:space="preserve">), Chiang </w:t>
-            </w:r>
-            <w:r>
-              <w:rPr>
-                <w:rFonts w:eastAsia="Arial Unicode MS"/>
-                <w:color w:val="000000"/>
-                <w:sz w:val="22"/>
-                <w:szCs w:val="22"/>
-              </w:rPr>
-              <w:t xml:space="preserve">e Wainwright </w:t>
+              <w:t xml:space="preserve">), </w:t>
+            </w:r>
+            <w:proofErr w:type="spellStart"/>
+            <w:r>
+              <w:rPr>
+                <w:rFonts w:eastAsia="Arial Unicode MS"/>
+                <w:color w:val="000000"/>
+                <w:sz w:val="22"/>
+                <w:szCs w:val="22"/>
+              </w:rPr>
+              <w:t>Chiang</w:t>
+            </w:r>
+            <w:proofErr w:type="spellEnd"/>
+            <w:r>
+              <w:rPr>
+                <w:rFonts w:eastAsia="Arial Unicode MS"/>
+                <w:color w:val="000000"/>
+                <w:sz w:val="22"/>
+                <w:szCs w:val="22"/>
+              </w:rPr>
+              <w:t xml:space="preserve"> </w:t>
+            </w:r>
+            <w:r>
+              <w:rPr>
+                <w:rFonts w:eastAsia="Arial Unicode MS"/>
+                <w:color w:val="000000"/>
+                <w:sz w:val="22"/>
+                <w:szCs w:val="22"/>
+              </w:rPr>
+              <w:t xml:space="preserve">e </w:t>
+            </w:r>
+            <w:proofErr w:type="spellStart"/>
+            <w:r>
+              <w:rPr>
+                <w:rFonts w:eastAsia="Arial Unicode MS"/>
+                <w:color w:val="000000"/>
+                <w:sz w:val="22"/>
+                <w:szCs w:val="22"/>
+              </w:rPr>
+              <w:t>Wainwright</w:t>
+            </w:r>
+            <w:proofErr w:type="spellEnd"/>
+            <w:r>
+              <w:rPr>
+                <w:rFonts w:eastAsia="Arial Unicode MS"/>
+                <w:color w:val="000000"/>
+                <w:sz w:val="22"/>
+                <w:szCs w:val="22"/>
+              </w:rPr>
+              <w:t xml:space="preserve"> </w:t>
             </w:r>
             <w:r>
               <w:rPr>
@@ -1904,14 +2139,25 @@
               <w:lastRenderedPageBreak/>
               <w:t xml:space="preserve">Leitura complementar: </w:t>
             </w:r>
-            <w:r>
-              <w:rPr>
-                <w:rFonts w:eastAsia="Arial Unicode MS"/>
-                <w:color w:val="000000"/>
-                <w:sz w:val="22"/>
-                <w:szCs w:val="22"/>
-              </w:rPr>
-              <w:t xml:space="preserve">Hoy et al. (caps. </w:t>
+            <w:proofErr w:type="spellStart"/>
+            <w:r>
+              <w:rPr>
+                <w:rFonts w:eastAsia="Arial Unicode MS"/>
+                <w:color w:val="000000"/>
+                <w:sz w:val="22"/>
+                <w:szCs w:val="22"/>
+              </w:rPr>
+              <w:t>Hoy</w:t>
+            </w:r>
+            <w:proofErr w:type="spellEnd"/>
+            <w:r>
+              <w:rPr>
+                <w:rFonts w:eastAsia="Arial Unicode MS"/>
+                <w:color w:val="000000"/>
+                <w:sz w:val="22"/>
+                <w:szCs w:val="22"/>
+              </w:rPr>
+              <w:t xml:space="preserve"> et al. (caps. </w:t>
             </w:r>
             <w:r>
               <w:rPr>
@@ -1956,7 +2202,27 @@
                 <w:sz w:val="22"/>
                 <w:szCs w:val="22"/>
               </w:rPr>
-              <w:t>Simon e Blume (cap</w:t>
+              <w:t xml:space="preserve">Simon e </w:t>
+            </w:r>
+            <w:proofErr w:type="spellStart"/>
+            <w:r>
+              <w:rPr>
+                <w:rFonts w:eastAsia="Arial Unicode MS"/>
+                <w:color w:val="000000"/>
+                <w:sz w:val="22"/>
+                <w:szCs w:val="22"/>
+              </w:rPr>
+              <w:t>Blume</w:t>
+            </w:r>
+            <w:proofErr w:type="spellEnd"/>
+            <w:r>
+              <w:rPr>
+                <w:rFonts w:eastAsia="Arial Unicode MS"/>
+                <w:color w:val="000000"/>
+                <w:sz w:val="22"/>
+                <w:szCs w:val="22"/>
+              </w:rPr>
+              <w:t xml:space="preserve"> (cap</w:t>
             </w:r>
             <w:r>
               <w:rPr>
@@ -2134,7 +2400,27 @@
                 <w:sz w:val="22"/>
                 <w:szCs w:val="22"/>
               </w:rPr>
-              <w:t>Simon e Blume (cap</w:t>
+              <w:t xml:space="preserve">Simon e </w:t>
+            </w:r>
+            <w:proofErr w:type="spellStart"/>
+            <w:r>
+              <w:rPr>
+                <w:rFonts w:eastAsia="Arial Unicode MS"/>
+                <w:color w:val="000000"/>
+                <w:sz w:val="22"/>
+                <w:szCs w:val="22"/>
+              </w:rPr>
+              <w:t>Blume</w:t>
+            </w:r>
+            <w:proofErr w:type="spellEnd"/>
+            <w:r>
+              <w:rPr>
+                <w:rFonts w:eastAsia="Arial Unicode MS"/>
+                <w:color w:val="000000"/>
+                <w:sz w:val="22"/>
+                <w:szCs w:val="22"/>
+              </w:rPr>
+              <w:t xml:space="preserve"> (cap</w:t>
             </w:r>
             <w:r>
               <w:rPr>
@@ -2216,14 +2502,25 @@
               </w:rPr>
               <w:t xml:space="preserve">Leitura básica: Nicholson e Snyder (cap. 2), </w:t>
             </w:r>
-            <w:r>
-              <w:rPr>
-                <w:rFonts w:eastAsia="Arial Unicode MS"/>
-                <w:color w:val="000000"/>
-                <w:sz w:val="22"/>
-                <w:szCs w:val="22"/>
-              </w:rPr>
-              <w:t>Hoy et al. (</w:t>
+            <w:proofErr w:type="spellStart"/>
+            <w:r>
+              <w:rPr>
+                <w:rFonts w:eastAsia="Arial Unicode MS"/>
+                <w:color w:val="000000"/>
+                <w:sz w:val="22"/>
+                <w:szCs w:val="22"/>
+              </w:rPr>
+              <w:t>Hoy</w:t>
+            </w:r>
+            <w:proofErr w:type="spellEnd"/>
+            <w:r>
+              <w:rPr>
+                <w:rFonts w:eastAsia="Arial Unicode MS"/>
+                <w:color w:val="000000"/>
+                <w:sz w:val="22"/>
+                <w:szCs w:val="22"/>
+              </w:rPr>
+              <w:t xml:space="preserve"> et al. (</w:t>
             </w:r>
             <w:r>
               <w:rPr>
@@ -2276,16 +2573,56 @@
                 <w:sz w:val="22"/>
                 <w:szCs w:val="22"/>
               </w:rPr>
-              <w:t xml:space="preserve">Leitura básica: Chiang </w:t>
-            </w:r>
-            <w:r>
-              <w:rPr>
-                <w:rFonts w:eastAsia="Arial Unicode MS"/>
-                <w:color w:val="000000"/>
-                <w:sz w:val="22"/>
-                <w:szCs w:val="22"/>
-              </w:rPr>
-              <w:t xml:space="preserve">e Wainwright </w:t>
+              <w:t xml:space="preserve">Leitura básica: </w:t>
+            </w:r>
+            <w:proofErr w:type="spellStart"/>
+            <w:r>
+              <w:rPr>
+                <w:rFonts w:eastAsia="Arial Unicode MS"/>
+                <w:color w:val="000000"/>
+                <w:sz w:val="22"/>
+                <w:szCs w:val="22"/>
+              </w:rPr>
+              <w:t>Chiang</w:t>
+            </w:r>
+            <w:proofErr w:type="spellEnd"/>
+            <w:r>
+              <w:rPr>
+                <w:rFonts w:eastAsia="Arial Unicode MS"/>
+                <w:color w:val="000000"/>
+                <w:sz w:val="22"/>
+                <w:szCs w:val="22"/>
+              </w:rPr>
+              <w:t xml:space="preserve"> </w:t>
+            </w:r>
+            <w:r>
+              <w:rPr>
+                <w:rFonts w:eastAsia="Arial Unicode MS"/>
+                <w:color w:val="000000"/>
+                <w:sz w:val="22"/>
+                <w:szCs w:val="22"/>
+              </w:rPr>
+              <w:t xml:space="preserve">e </w:t>
+            </w:r>
+            <w:proofErr w:type="spellStart"/>
+            <w:r>
+              <w:rPr>
+                <w:rFonts w:eastAsia="Arial Unicode MS"/>
+                <w:color w:val="000000"/>
+                <w:sz w:val="22"/>
+                <w:szCs w:val="22"/>
+              </w:rPr>
+              <w:t>Wainwright</w:t>
+            </w:r>
+            <w:proofErr w:type="spellEnd"/>
+            <w:r>
+              <w:rPr>
+                <w:rFonts w:eastAsia="Arial Unicode MS"/>
+                <w:color w:val="000000"/>
+                <w:sz w:val="22"/>
+                <w:szCs w:val="22"/>
+              </w:rPr>
+              <w:t xml:space="preserve"> </w:t>
             </w:r>
             <w:r>
               <w:rPr>
@@ -2330,7 +2667,27 @@
                 <w:sz w:val="22"/>
                 <w:szCs w:val="22"/>
               </w:rPr>
-              <w:t>), Simon e Blume (cap</w:t>
+              <w:t xml:space="preserve">), Simon e </w:t>
+            </w:r>
+            <w:proofErr w:type="spellStart"/>
+            <w:r>
+              <w:rPr>
+                <w:rFonts w:eastAsia="Arial Unicode MS"/>
+                <w:color w:val="000000"/>
+                <w:sz w:val="22"/>
+                <w:szCs w:val="22"/>
+              </w:rPr>
+              <w:t>Blume</w:t>
+            </w:r>
+            <w:proofErr w:type="spellEnd"/>
+            <w:r>
+              <w:rPr>
+                <w:rFonts w:eastAsia="Arial Unicode MS"/>
+                <w:color w:val="000000"/>
+                <w:sz w:val="22"/>
+                <w:szCs w:val="22"/>
+              </w:rPr>
+              <w:t xml:space="preserve"> (cap</w:t>
             </w:r>
             <w:r>
               <w:rPr>
@@ -2406,14 +2763,25 @@
               </w:rPr>
               <w:t xml:space="preserve">Leitura complementar: </w:t>
             </w:r>
-            <w:r>
-              <w:rPr>
-                <w:rFonts w:eastAsia="Arial Unicode MS"/>
-                <w:color w:val="000000"/>
-                <w:sz w:val="22"/>
-                <w:szCs w:val="22"/>
-              </w:rPr>
-              <w:t xml:space="preserve">Hoy et al. (cap. 6, 12 e </w:t>
+            <w:proofErr w:type="spellStart"/>
+            <w:r>
+              <w:rPr>
+                <w:rFonts w:eastAsia="Arial Unicode MS"/>
+                <w:color w:val="000000"/>
+                <w:sz w:val="22"/>
+                <w:szCs w:val="22"/>
+              </w:rPr>
+              <w:t>Hoy</w:t>
+            </w:r>
+            <w:proofErr w:type="spellEnd"/>
+            <w:r>
+              <w:rPr>
+                <w:rFonts w:eastAsia="Arial Unicode MS"/>
+                <w:color w:val="000000"/>
+                <w:sz w:val="22"/>
+                <w:szCs w:val="22"/>
+              </w:rPr>
+              <w:t xml:space="preserve"> et al. (cap. 6, 12 e </w:t>
             </w:r>
             <w:r>
               <w:rPr>
@@ -2546,7 +2914,47 @@
                 <w:sz w:val="22"/>
                 <w:szCs w:val="22"/>
               </w:rPr>
-              <w:t>Leitura básica: Chiang e Wainwright (cap. 12), Nicholson e Snyder (cap. 2)</w:t>
+              <w:t xml:space="preserve">Leitura básica: </w:t>
+            </w:r>
+            <w:proofErr w:type="spellStart"/>
+            <w:r>
+              <w:rPr>
+                <w:rFonts w:eastAsia="Arial Unicode MS"/>
+                <w:color w:val="000000"/>
+                <w:sz w:val="22"/>
+                <w:szCs w:val="22"/>
+              </w:rPr>
+              <w:t>Chiang</w:t>
+            </w:r>
+            <w:proofErr w:type="spellEnd"/>
+            <w:r>
+              <w:rPr>
+                <w:rFonts w:eastAsia="Arial Unicode MS"/>
+                <w:color w:val="000000"/>
+                <w:sz w:val="22"/>
+                <w:szCs w:val="22"/>
+              </w:rPr>
+              <w:t xml:space="preserve"> e </w:t>
+            </w:r>
+            <w:proofErr w:type="spellStart"/>
+            <w:r>
+              <w:rPr>
+                <w:rFonts w:eastAsia="Arial Unicode MS"/>
+                <w:color w:val="000000"/>
+                <w:sz w:val="22"/>
+                <w:szCs w:val="22"/>
+              </w:rPr>
+              <w:t>Wainwright</w:t>
+            </w:r>
+            <w:proofErr w:type="spellEnd"/>
+            <w:r>
+              <w:rPr>
+                <w:rFonts w:eastAsia="Arial Unicode MS"/>
+                <w:color w:val="000000"/>
+                <w:sz w:val="22"/>
+                <w:szCs w:val="22"/>
+              </w:rPr>
+              <w:t xml:space="preserve"> (cap. 12), Nicholson e Snyder (cap. 2)</w:t>
             </w:r>
           </w:p>
           <w:p>
@@ -2567,7 +2975,27 @@
                 <w:sz w:val="22"/>
                 <w:szCs w:val="22"/>
               </w:rPr>
-              <w:t>Leitura complementar: Simon e Blume (caps. 18 e 19)</w:t>
+              <w:t xml:space="preserve">Leitura complementar: Simon e </w:t>
+            </w:r>
+            <w:proofErr w:type="spellStart"/>
+            <w:r>
+              <w:rPr>
+                <w:rFonts w:eastAsia="Arial Unicode MS"/>
+                <w:color w:val="000000"/>
+                <w:sz w:val="22"/>
+                <w:szCs w:val="22"/>
+              </w:rPr>
+              <w:t>Blume</w:t>
+            </w:r>
+            <w:proofErr w:type="spellEnd"/>
+            <w:r>
+              <w:rPr>
+                <w:rFonts w:eastAsia="Arial Unicode MS"/>
+                <w:color w:val="000000"/>
+                <w:sz w:val="22"/>
+                <w:szCs w:val="22"/>
+              </w:rPr>
+              <w:t xml:space="preserve"> (caps. 18 e 19)</w:t>
             </w:r>
           </w:p>
           <w:p>
@@ -2612,7 +3040,47 @@
                 <w:sz w:val="22"/>
                 <w:szCs w:val="22"/>
               </w:rPr>
-              <w:t>Leitura básica: Chiang e Wainwright (cap. 12)</w:t>
+              <w:t xml:space="preserve">Leitura básica: </w:t>
+            </w:r>
+            <w:proofErr w:type="spellStart"/>
+            <w:r>
+              <w:rPr>
+                <w:rFonts w:eastAsia="Arial Unicode MS"/>
+                <w:color w:val="000000"/>
+                <w:sz w:val="22"/>
+                <w:szCs w:val="22"/>
+              </w:rPr>
+              <w:t>Chiang</w:t>
+            </w:r>
+            <w:proofErr w:type="spellEnd"/>
+            <w:r>
+              <w:rPr>
+                <w:rFonts w:eastAsia="Arial Unicode MS"/>
+                <w:color w:val="000000"/>
+                <w:sz w:val="22"/>
+                <w:szCs w:val="22"/>
+              </w:rPr>
+              <w:t xml:space="preserve"> e </w:t>
+            </w:r>
+            <w:proofErr w:type="spellStart"/>
+            <w:r>
+              <w:rPr>
+                <w:rFonts w:eastAsia="Arial Unicode MS"/>
+                <w:color w:val="000000"/>
+                <w:sz w:val="22"/>
+                <w:szCs w:val="22"/>
+              </w:rPr>
+              <w:t>Wainwright</w:t>
+            </w:r>
+            <w:proofErr w:type="spellEnd"/>
+            <w:r>
+              <w:rPr>
+                <w:rFonts w:eastAsia="Arial Unicode MS"/>
+                <w:color w:val="000000"/>
+                <w:sz w:val="22"/>
+                <w:szCs w:val="22"/>
+              </w:rPr>
+              <w:t xml:space="preserve"> (cap. 12)</w:t>
             </w:r>
           </w:p>
           <w:p>
@@ -2657,7 +3125,47 @@
                 <w:sz w:val="22"/>
                 <w:szCs w:val="22"/>
               </w:rPr>
-              <w:t>Leitura básica: Chiang e Wainwright (cap. 12)</w:t>
+              <w:t xml:space="preserve">Leitura básica: </w:t>
+            </w:r>
+            <w:proofErr w:type="spellStart"/>
+            <w:r>
+              <w:rPr>
+                <w:rFonts w:eastAsia="Arial Unicode MS"/>
+                <w:color w:val="000000"/>
+                <w:sz w:val="22"/>
+                <w:szCs w:val="22"/>
+              </w:rPr>
+              <w:t>Chiang</w:t>
+            </w:r>
+            <w:proofErr w:type="spellEnd"/>
+            <w:r>
+              <w:rPr>
+                <w:rFonts w:eastAsia="Arial Unicode MS"/>
+                <w:color w:val="000000"/>
+                <w:sz w:val="22"/>
+                <w:szCs w:val="22"/>
+              </w:rPr>
+              <w:t xml:space="preserve"> e </w:t>
+            </w:r>
+            <w:proofErr w:type="spellStart"/>
+            <w:r>
+              <w:rPr>
+                <w:rFonts w:eastAsia="Arial Unicode MS"/>
+                <w:color w:val="000000"/>
+                <w:sz w:val="22"/>
+                <w:szCs w:val="22"/>
+              </w:rPr>
+              <w:t>Wainwright</w:t>
+            </w:r>
+            <w:proofErr w:type="spellEnd"/>
+            <w:r>
+              <w:rPr>
+                <w:rFonts w:eastAsia="Arial Unicode MS"/>
+                <w:color w:val="000000"/>
+                <w:sz w:val="22"/>
+                <w:szCs w:val="22"/>
+              </w:rPr>
+              <w:t xml:space="preserve"> (cap. 12)</w:t>
             </w:r>
             <w:r>
               <w:rPr>
@@ -2687,7 +3195,27 @@
                 <w:sz w:val="22"/>
                 <w:szCs w:val="22"/>
               </w:rPr>
-              <w:t>Leitura complementar: Simon e Blume (cap. 19)</w:t>
+              <w:t xml:space="preserve">Leitura complementar: Simon e </w:t>
+            </w:r>
+            <w:proofErr w:type="spellStart"/>
+            <w:r>
+              <w:rPr>
+                <w:rFonts w:eastAsia="Arial Unicode MS"/>
+                <w:color w:val="000000"/>
+                <w:sz w:val="22"/>
+                <w:szCs w:val="22"/>
+              </w:rPr>
+              <w:t>Blume</w:t>
+            </w:r>
+            <w:proofErr w:type="spellEnd"/>
+            <w:r>
+              <w:rPr>
+                <w:rFonts w:eastAsia="Arial Unicode MS"/>
+                <w:color w:val="000000"/>
+                <w:sz w:val="22"/>
+                <w:szCs w:val="22"/>
+              </w:rPr>
+              <w:t xml:space="preserve"> (cap. 19)</w:t>
             </w:r>
           </w:p>
           <w:p>
@@ -2732,7 +3260,47 @@
                 <w:sz w:val="22"/>
                 <w:szCs w:val="22"/>
               </w:rPr>
-              <w:t>Leitura básica: Chiang e Wainwright (cap. 12)</w:t>
+              <w:t xml:space="preserve">Leitura básica: </w:t>
+            </w:r>
+            <w:proofErr w:type="spellStart"/>
+            <w:r>
+              <w:rPr>
+                <w:rFonts w:eastAsia="Arial Unicode MS"/>
+                <w:color w:val="000000"/>
+                <w:sz w:val="22"/>
+                <w:szCs w:val="22"/>
+              </w:rPr>
+              <w:t>Chiang</w:t>
+            </w:r>
+            <w:proofErr w:type="spellEnd"/>
+            <w:r>
+              <w:rPr>
+                <w:rFonts w:eastAsia="Arial Unicode MS"/>
+                <w:color w:val="000000"/>
+                <w:sz w:val="22"/>
+                <w:szCs w:val="22"/>
+              </w:rPr>
+              <w:t xml:space="preserve"> e </w:t>
+            </w:r>
+            <w:proofErr w:type="spellStart"/>
+            <w:r>
+              <w:rPr>
+                <w:rFonts w:eastAsia="Arial Unicode MS"/>
+                <w:color w:val="000000"/>
+                <w:sz w:val="22"/>
+                <w:szCs w:val="22"/>
+              </w:rPr>
+              <w:t>Wainwright</w:t>
+            </w:r>
+            <w:proofErr w:type="spellEnd"/>
+            <w:r>
+              <w:rPr>
+                <w:rFonts w:eastAsia="Arial Unicode MS"/>
+                <w:color w:val="000000"/>
+                <w:sz w:val="22"/>
+                <w:szCs w:val="22"/>
+              </w:rPr>
+              <w:t xml:space="preserve"> (cap. 12)</w:t>
             </w:r>
           </w:p>
           <w:p>
@@ -2753,7 +3321,27 @@
                 <w:sz w:val="22"/>
                 <w:szCs w:val="22"/>
               </w:rPr>
-              <w:t>Leitura complementar: Simon e Blume (cap. 19)</w:t>
+              <w:t xml:space="preserve">Leitura complementar: Simon e </w:t>
+            </w:r>
+            <w:proofErr w:type="spellStart"/>
+            <w:r>
+              <w:rPr>
+                <w:rFonts w:eastAsia="Arial Unicode MS"/>
+                <w:color w:val="000000"/>
+                <w:sz w:val="22"/>
+                <w:szCs w:val="22"/>
+              </w:rPr>
+              <w:t>Blume</w:t>
+            </w:r>
+            <w:proofErr w:type="spellEnd"/>
+            <w:r>
+              <w:rPr>
+                <w:rFonts w:eastAsia="Arial Unicode MS"/>
+                <w:color w:val="000000"/>
+                <w:sz w:val="22"/>
+                <w:szCs w:val="22"/>
+              </w:rPr>
+              <w:t xml:space="preserve"> (cap. 19)</w:t>
             </w:r>
           </w:p>
           <w:p>
@@ -2798,7 +3386,47 @@
                 <w:sz w:val="22"/>
                 <w:szCs w:val="22"/>
               </w:rPr>
-              <w:t>Leitura básica: Chiang e Wainwright (cap. 12)</w:t>
+              <w:t xml:space="preserve">Leitura básica: </w:t>
+            </w:r>
+            <w:proofErr w:type="spellStart"/>
+            <w:r>
+              <w:rPr>
+                <w:rFonts w:eastAsia="Arial Unicode MS"/>
+                <w:color w:val="000000"/>
+                <w:sz w:val="22"/>
+                <w:szCs w:val="22"/>
+              </w:rPr>
+              <w:t>Chiang</w:t>
+            </w:r>
+            <w:proofErr w:type="spellEnd"/>
+            <w:r>
+              <w:rPr>
+                <w:rFonts w:eastAsia="Arial Unicode MS"/>
+                <w:color w:val="000000"/>
+                <w:sz w:val="22"/>
+                <w:szCs w:val="22"/>
+              </w:rPr>
+              <w:t xml:space="preserve"> e </w:t>
+            </w:r>
+            <w:proofErr w:type="spellStart"/>
+            <w:r>
+              <w:rPr>
+                <w:rFonts w:eastAsia="Arial Unicode MS"/>
+                <w:color w:val="000000"/>
+                <w:sz w:val="22"/>
+                <w:szCs w:val="22"/>
+              </w:rPr>
+              <w:t>Wainwright</w:t>
+            </w:r>
+            <w:proofErr w:type="spellEnd"/>
+            <w:r>
+              <w:rPr>
+                <w:rFonts w:eastAsia="Arial Unicode MS"/>
+                <w:color w:val="000000"/>
+                <w:sz w:val="22"/>
+                <w:szCs w:val="22"/>
+              </w:rPr>
+              <w:t xml:space="preserve"> (cap. 12)</w:t>
             </w:r>
           </w:p>
           <w:p>
@@ -2819,7 +3447,27 @@
                 <w:sz w:val="22"/>
                 <w:szCs w:val="22"/>
               </w:rPr>
-              <w:t xml:space="preserve">Leitura complementar: Simon e Blume (caps. </w:t>
+              <w:t xml:space="preserve">Leitura complementar: Simon e </w:t>
+            </w:r>
+            <w:proofErr w:type="spellStart"/>
+            <w:r>
+              <w:rPr>
+                <w:rFonts w:eastAsia="Arial Unicode MS"/>
+                <w:color w:val="000000"/>
+                <w:sz w:val="22"/>
+                <w:szCs w:val="22"/>
+              </w:rPr>
+              <w:t>Blume</w:t>
+            </w:r>
+            <w:proofErr w:type="spellEnd"/>
+            <w:r>
+              <w:rPr>
+                <w:rFonts w:eastAsia="Arial Unicode MS"/>
+                <w:color w:val="000000"/>
+                <w:sz w:val="22"/>
+                <w:szCs w:val="22"/>
+              </w:rPr>
+              <w:t xml:space="preserve"> (caps. </w:t>
             </w:r>
             <w:r>
               <w:rPr>
@@ -2876,7 +3524,27 @@
                 <w:sz w:val="22"/>
                 <w:szCs w:val="22"/>
               </w:rPr>
-              <w:t>Restrições de desigualdade e condições de Karush-Kuhn-Tucker</w:t>
+              <w:t xml:space="preserve">Restrições de desigualdade e condições de </w:t>
+            </w:r>
+            <w:proofErr w:type="spellStart"/>
+            <w:r>
+              <w:rPr>
+                <w:rFonts w:eastAsia="Arial Unicode MS"/>
+                <w:color w:val="000000"/>
+                <w:sz w:val="22"/>
+                <w:szCs w:val="22"/>
+              </w:rPr>
+              <w:t>Karush</w:t>
+            </w:r>
+            <w:proofErr w:type="spellEnd"/>
+            <w:r>
+              <w:rPr>
+                <w:rFonts w:eastAsia="Arial Unicode MS"/>
+                <w:color w:val="000000"/>
+                <w:sz w:val="22"/>
+                <w:szCs w:val="22"/>
+              </w:rPr>
+              <w:t>-Kuhn-Tucker</w:t>
             </w:r>
           </w:p>
           <w:p>
@@ -2897,7 +3565,47 @@
                 <w:sz w:val="22"/>
                 <w:szCs w:val="22"/>
               </w:rPr>
-              <w:t>Leitura básica: Chiang e Wainwright (cap. 13)</w:t>
+              <w:t xml:space="preserve">Leitura básica: </w:t>
+            </w:r>
+            <w:proofErr w:type="spellStart"/>
+            <w:r>
+              <w:rPr>
+                <w:rFonts w:eastAsia="Arial Unicode MS"/>
+                <w:color w:val="000000"/>
+                <w:sz w:val="22"/>
+                <w:szCs w:val="22"/>
+              </w:rPr>
+              <w:t>Chiang</w:t>
+            </w:r>
+            <w:proofErr w:type="spellEnd"/>
+            <w:r>
+              <w:rPr>
+                <w:rFonts w:eastAsia="Arial Unicode MS"/>
+                <w:color w:val="000000"/>
+                <w:sz w:val="22"/>
+                <w:szCs w:val="22"/>
+              </w:rPr>
+              <w:t xml:space="preserve"> e </w:t>
+            </w:r>
+            <w:proofErr w:type="spellStart"/>
+            <w:r>
+              <w:rPr>
+                <w:rFonts w:eastAsia="Arial Unicode MS"/>
+                <w:color w:val="000000"/>
+                <w:sz w:val="22"/>
+                <w:szCs w:val="22"/>
+              </w:rPr>
+              <w:t>Wainwright</w:t>
+            </w:r>
+            <w:proofErr w:type="spellEnd"/>
+            <w:r>
+              <w:rPr>
+                <w:rFonts w:eastAsia="Arial Unicode MS"/>
+                <w:color w:val="000000"/>
+                <w:sz w:val="22"/>
+                <w:szCs w:val="22"/>
+              </w:rPr>
+              <w:t xml:space="preserve"> (cap. 13)</w:t>
             </w:r>
           </w:p>
           <w:p>
@@ -2918,7 +3626,27 @@
                 <w:sz w:val="22"/>
                 <w:szCs w:val="22"/>
               </w:rPr>
-              <w:t>Leitura complementar: Nicholson e Snyder (cap. 2), Simon e Blume (caps. 18 e 19)</w:t>
+              <w:t xml:space="preserve">Leitura complementar: Nicholson e Snyder (cap. 2), Simon e </w:t>
+            </w:r>
+            <w:proofErr w:type="spellStart"/>
+            <w:r>
+              <w:rPr>
+                <w:rFonts w:eastAsia="Arial Unicode MS"/>
+                <w:color w:val="000000"/>
+                <w:sz w:val="22"/>
+                <w:szCs w:val="22"/>
+              </w:rPr>
+              <w:t>Blume</w:t>
+            </w:r>
+            <w:proofErr w:type="spellEnd"/>
+            <w:r>
+              <w:rPr>
+                <w:rFonts w:eastAsia="Arial Unicode MS"/>
+                <w:color w:val="000000"/>
+                <w:sz w:val="22"/>
+                <w:szCs w:val="22"/>
+              </w:rPr>
+              <w:t xml:space="preserve"> (caps. 18 e 19)</w:t>
             </w:r>
           </w:p>
           <w:p>
@@ -2965,14 +3693,45 @@
               </w:rPr>
               <w:t xml:space="preserve">Leitura básica: </w:t>
             </w:r>
-            <w:r>
-              <w:rPr>
-                <w:rFonts w:eastAsia="Arial Unicode MS"/>
-                <w:color w:val="000000"/>
-                <w:sz w:val="22"/>
-                <w:szCs w:val="22"/>
-              </w:rPr>
-              <w:t>Chiang e Wainwright (cap. 13)</w:t>
+            <w:proofErr w:type="spellStart"/>
+            <w:r>
+              <w:rPr>
+                <w:rFonts w:eastAsia="Arial Unicode MS"/>
+                <w:color w:val="000000"/>
+                <w:sz w:val="22"/>
+                <w:szCs w:val="22"/>
+              </w:rPr>
+              <w:t>Chiang</w:t>
+            </w:r>
+            <w:proofErr w:type="spellEnd"/>
+            <w:r>
+              <w:rPr>
+                <w:rFonts w:eastAsia="Arial Unicode MS"/>
+                <w:color w:val="000000"/>
+                <w:sz w:val="22"/>
+                <w:szCs w:val="22"/>
+              </w:rPr>
+              <w:t xml:space="preserve"> e </w:t>
+            </w:r>
+            <w:proofErr w:type="spellStart"/>
+            <w:r>
+              <w:rPr>
+                <w:rFonts w:eastAsia="Arial Unicode MS"/>
+                <w:color w:val="000000"/>
+                <w:sz w:val="22"/>
+                <w:szCs w:val="22"/>
+              </w:rPr>
+              <w:t>Wainwright</w:t>
+            </w:r>
+            <w:proofErr w:type="spellEnd"/>
+            <w:r>
+              <w:rPr>
+                <w:rFonts w:eastAsia="Arial Unicode MS"/>
+                <w:color w:val="000000"/>
+                <w:sz w:val="22"/>
+                <w:szCs w:val="22"/>
+              </w:rPr>
+              <w:t xml:space="preserve"> (cap. 13)</w:t>
             </w:r>
           </w:p>
           <w:p>
@@ -2993,7 +3752,27 @@
                 <w:sz w:val="22"/>
                 <w:szCs w:val="22"/>
               </w:rPr>
-              <w:t>Leitura complementar: Nicholson e Snyder (cap. 2), Simon e Blume (cap. 19)</w:t>
+              <w:t xml:space="preserve">Leitura complementar: Nicholson e Snyder (cap. 2), Simon e </w:t>
+            </w:r>
+            <w:proofErr w:type="spellStart"/>
+            <w:r>
+              <w:rPr>
+                <w:rFonts w:eastAsia="Arial Unicode MS"/>
+                <w:color w:val="000000"/>
+                <w:sz w:val="22"/>
+                <w:szCs w:val="22"/>
+              </w:rPr>
+              <w:t>Blume</w:t>
+            </w:r>
+            <w:proofErr w:type="spellEnd"/>
+            <w:r>
+              <w:rPr>
+                <w:rFonts w:eastAsia="Arial Unicode MS"/>
+                <w:color w:val="000000"/>
+                <w:sz w:val="22"/>
+                <w:szCs w:val="22"/>
+              </w:rPr>
+              <w:t xml:space="preserve"> (cap. 19)</w:t>
             </w:r>
           </w:p>
           <w:p>
@@ -3038,7 +3817,47 @@
                 <w:sz w:val="22"/>
                 <w:szCs w:val="22"/>
               </w:rPr>
-              <w:t>Leitura básica: Chiang e Wainwright (cap. 13)</w:t>
+              <w:t xml:space="preserve">Leitura básica: </w:t>
+            </w:r>
+            <w:proofErr w:type="spellStart"/>
+            <w:r>
+              <w:rPr>
+                <w:rFonts w:eastAsia="Arial Unicode MS"/>
+                <w:color w:val="000000"/>
+                <w:sz w:val="22"/>
+                <w:szCs w:val="22"/>
+              </w:rPr>
+              <w:t>Chiang</w:t>
+            </w:r>
+            <w:proofErr w:type="spellEnd"/>
+            <w:r>
+              <w:rPr>
+                <w:rFonts w:eastAsia="Arial Unicode MS"/>
+                <w:color w:val="000000"/>
+                <w:sz w:val="22"/>
+                <w:szCs w:val="22"/>
+              </w:rPr>
+              <w:t xml:space="preserve"> e </w:t>
+            </w:r>
+            <w:proofErr w:type="spellStart"/>
+            <w:r>
+              <w:rPr>
+                <w:rFonts w:eastAsia="Arial Unicode MS"/>
+                <w:color w:val="000000"/>
+                <w:sz w:val="22"/>
+                <w:szCs w:val="22"/>
+              </w:rPr>
+              <w:t>Wainwright</w:t>
+            </w:r>
+            <w:proofErr w:type="spellEnd"/>
+            <w:r>
+              <w:rPr>
+                <w:rFonts w:eastAsia="Arial Unicode MS"/>
+                <w:color w:val="000000"/>
+                <w:sz w:val="22"/>
+                <w:szCs w:val="22"/>
+              </w:rPr>
+              <w:t xml:space="preserve"> (cap. 13)</w:t>
             </w:r>
           </w:p>
           <w:p>
@@ -3059,7 +3878,27 @@
                 <w:sz w:val="22"/>
                 <w:szCs w:val="22"/>
               </w:rPr>
-              <w:t>Leitura complementar: Nicholson e Snyder (cap. 2), Simon e Blume (cap. 19)</w:t>
+              <w:t xml:space="preserve">Leitura complementar: Nicholson e Snyder (cap. 2), Simon e </w:t>
+            </w:r>
+            <w:proofErr w:type="spellStart"/>
+            <w:r>
+              <w:rPr>
+                <w:rFonts w:eastAsia="Arial Unicode MS"/>
+                <w:color w:val="000000"/>
+                <w:sz w:val="22"/>
+                <w:szCs w:val="22"/>
+              </w:rPr>
+              <w:t>Blume</w:t>
+            </w:r>
+            <w:proofErr w:type="spellEnd"/>
+            <w:r>
+              <w:rPr>
+                <w:rFonts w:eastAsia="Arial Unicode MS"/>
+                <w:color w:val="000000"/>
+                <w:sz w:val="22"/>
+                <w:szCs w:val="22"/>
+              </w:rPr>
+              <w:t xml:space="preserve"> (cap. 19)</w:t>
             </w:r>
           </w:p>
           <w:p>
@@ -3104,7 +3943,47 @@
                 <w:sz w:val="22"/>
                 <w:szCs w:val="22"/>
               </w:rPr>
-              <w:t>Leitura básica: Chiang e Wainwright (cap. 13)</w:t>
+              <w:t xml:space="preserve">Leitura básica: </w:t>
+            </w:r>
+            <w:proofErr w:type="spellStart"/>
+            <w:r>
+              <w:rPr>
+                <w:rFonts w:eastAsia="Arial Unicode MS"/>
+                <w:color w:val="000000"/>
+                <w:sz w:val="22"/>
+                <w:szCs w:val="22"/>
+              </w:rPr>
+              <w:t>Chiang</w:t>
+            </w:r>
+            <w:proofErr w:type="spellEnd"/>
+            <w:r>
+              <w:rPr>
+                <w:rFonts w:eastAsia="Arial Unicode MS"/>
+                <w:color w:val="000000"/>
+                <w:sz w:val="22"/>
+                <w:szCs w:val="22"/>
+              </w:rPr>
+              <w:t xml:space="preserve"> e </w:t>
+            </w:r>
+            <w:proofErr w:type="spellStart"/>
+            <w:r>
+              <w:rPr>
+                <w:rFonts w:eastAsia="Arial Unicode MS"/>
+                <w:color w:val="000000"/>
+                <w:sz w:val="22"/>
+                <w:szCs w:val="22"/>
+              </w:rPr>
+              <w:t>Wainwright</w:t>
+            </w:r>
+            <w:proofErr w:type="spellEnd"/>
+            <w:r>
+              <w:rPr>
+                <w:rFonts w:eastAsia="Arial Unicode MS"/>
+                <w:color w:val="000000"/>
+                <w:sz w:val="22"/>
+                <w:szCs w:val="22"/>
+              </w:rPr>
+              <w:t xml:space="preserve"> (cap. 13)</w:t>
             </w:r>
           </w:p>
           <w:p>
@@ -3125,7 +4004,27 @@
                 <w:sz w:val="22"/>
                 <w:szCs w:val="22"/>
               </w:rPr>
-              <w:t>Leitura complementar: Simon e Blume (caps. 18, 19 e 22)</w:t>
+              <w:t xml:space="preserve">Leitura complementar: Simon e </w:t>
+            </w:r>
+            <w:proofErr w:type="spellStart"/>
+            <w:r>
+              <w:rPr>
+                <w:rFonts w:eastAsia="Arial Unicode MS"/>
+                <w:color w:val="000000"/>
+                <w:sz w:val="22"/>
+                <w:szCs w:val="22"/>
+              </w:rPr>
+              <w:t>Blume</w:t>
+            </w:r>
+            <w:proofErr w:type="spellEnd"/>
+            <w:r>
+              <w:rPr>
+                <w:rFonts w:eastAsia="Arial Unicode MS"/>
+                <w:color w:val="000000"/>
+                <w:sz w:val="22"/>
+                <w:szCs w:val="22"/>
+              </w:rPr>
+              <w:t xml:space="preserve"> (caps. 18, 19 e 22)</w:t>
             </w:r>
           </w:p>
           <w:p>
@@ -3255,7 +4154,47 @@
                 <w:sz w:val="22"/>
                 <w:szCs w:val="22"/>
               </w:rPr>
-              <w:t>Leitura básica: Chiang e Wainwright (cap. 12)</w:t>
+              <w:t xml:space="preserve">Leitura básica: </w:t>
+            </w:r>
+            <w:proofErr w:type="spellStart"/>
+            <w:r>
+              <w:rPr>
+                <w:rFonts w:eastAsia="Arial Unicode MS"/>
+                <w:color w:val="000000"/>
+                <w:sz w:val="22"/>
+                <w:szCs w:val="22"/>
+              </w:rPr>
+              <w:t>Chiang</w:t>
+            </w:r>
+            <w:proofErr w:type="spellEnd"/>
+            <w:r>
+              <w:rPr>
+                <w:rFonts w:eastAsia="Arial Unicode MS"/>
+                <w:color w:val="000000"/>
+                <w:sz w:val="22"/>
+                <w:szCs w:val="22"/>
+              </w:rPr>
+              <w:t xml:space="preserve"> e </w:t>
+            </w:r>
+            <w:proofErr w:type="spellStart"/>
+            <w:r>
+              <w:rPr>
+                <w:rFonts w:eastAsia="Arial Unicode MS"/>
+                <w:color w:val="000000"/>
+                <w:sz w:val="22"/>
+                <w:szCs w:val="22"/>
+              </w:rPr>
+              <w:t>Wainwright</w:t>
+            </w:r>
+            <w:proofErr w:type="spellEnd"/>
+            <w:r>
+              <w:rPr>
+                <w:rFonts w:eastAsia="Arial Unicode MS"/>
+                <w:color w:val="000000"/>
+                <w:sz w:val="22"/>
+                <w:szCs w:val="22"/>
+              </w:rPr>
+              <w:t xml:space="preserve"> (cap. 12)</w:t>
             </w:r>
           </w:p>
           <w:p>
@@ -3275,7 +4214,27 @@
                 <w:sz w:val="22"/>
                 <w:szCs w:val="22"/>
               </w:rPr>
-              <w:t>Leitura complementar: Nicholson e Snyder (cap. 2), Simon e Blume (cap. 20)</w:t>
+              <w:t xml:space="preserve">Leitura complementar: Nicholson e Snyder (cap. 2), Simon e </w:t>
+            </w:r>
+            <w:proofErr w:type="spellStart"/>
+            <w:r>
+              <w:rPr>
+                <w:rFonts w:eastAsia="Arial Unicode MS"/>
+                <w:color w:val="000000"/>
+                <w:sz w:val="22"/>
+                <w:szCs w:val="22"/>
+              </w:rPr>
+              <w:t>Blume</w:t>
+            </w:r>
+            <w:proofErr w:type="spellEnd"/>
+            <w:r>
+              <w:rPr>
+                <w:rFonts w:eastAsia="Arial Unicode MS"/>
+                <w:color w:val="000000"/>
+                <w:sz w:val="22"/>
+                <w:szCs w:val="22"/>
+              </w:rPr>
+              <w:t xml:space="preserve"> (cap. 20)</w:t>
             </w:r>
           </w:p>
           <w:p>
@@ -3337,7 +4296,27 @@
                 <w:sz w:val="22"/>
                 <w:szCs w:val="22"/>
               </w:rPr>
-              <w:t>Simon e Blume (cap. 21)</w:t>
+              <w:t xml:space="preserve">Simon e </w:t>
+            </w:r>
+            <w:proofErr w:type="spellStart"/>
+            <w:r>
+              <w:rPr>
+                <w:rFonts w:eastAsia="Arial Unicode MS"/>
+                <w:color w:val="000000"/>
+                <w:sz w:val="22"/>
+                <w:szCs w:val="22"/>
+              </w:rPr>
+              <w:t>Blume</w:t>
+            </w:r>
+            <w:proofErr w:type="spellEnd"/>
+            <w:r>
+              <w:rPr>
+                <w:rFonts w:eastAsia="Arial Unicode MS"/>
+                <w:color w:val="000000"/>
+                <w:sz w:val="22"/>
+                <w:szCs w:val="22"/>
+              </w:rPr>
+              <w:t xml:space="preserve"> (cap. 21)</w:t>
             </w:r>
           </w:p>
           <w:p>
@@ -3480,14 +4459,45 @@
               </w:rPr>
               <w:t xml:space="preserve">Leitura básica: </w:t>
             </w:r>
-            <w:r>
-              <w:rPr>
-                <w:rFonts w:eastAsia="Arial Unicode MS"/>
-                <w:color w:val="000000"/>
-                <w:sz w:val="22"/>
-                <w:szCs w:val="22"/>
-              </w:rPr>
-              <w:t>Chiang e Wainwright (cap. 12)</w:t>
+            <w:proofErr w:type="spellStart"/>
+            <w:r>
+              <w:rPr>
+                <w:rFonts w:eastAsia="Arial Unicode MS"/>
+                <w:color w:val="000000"/>
+                <w:sz w:val="22"/>
+                <w:szCs w:val="22"/>
+              </w:rPr>
+              <w:t>Chiang</w:t>
+            </w:r>
+            <w:proofErr w:type="spellEnd"/>
+            <w:r>
+              <w:rPr>
+                <w:rFonts w:eastAsia="Arial Unicode MS"/>
+                <w:color w:val="000000"/>
+                <w:sz w:val="22"/>
+                <w:szCs w:val="22"/>
+              </w:rPr>
+              <w:t xml:space="preserve"> e </w:t>
+            </w:r>
+            <w:proofErr w:type="spellStart"/>
+            <w:r>
+              <w:rPr>
+                <w:rFonts w:eastAsia="Arial Unicode MS"/>
+                <w:color w:val="000000"/>
+                <w:sz w:val="22"/>
+                <w:szCs w:val="22"/>
+              </w:rPr>
+              <w:t>Wainwright</w:t>
+            </w:r>
+            <w:proofErr w:type="spellEnd"/>
+            <w:r>
+              <w:rPr>
+                <w:rFonts w:eastAsia="Arial Unicode MS"/>
+                <w:color w:val="000000"/>
+                <w:sz w:val="22"/>
+                <w:szCs w:val="22"/>
+              </w:rPr>
+              <w:t xml:space="preserve"> (cap. 12)</w:t>
             </w:r>
           </w:p>
           <w:p>
@@ -3516,7 +4526,27 @@
                 <w:sz w:val="22"/>
                 <w:szCs w:val="22"/>
               </w:rPr>
-              <w:t>Nicholson e Snyder (cap. 2), Simon e Blume (cap. 21)</w:t>
+              <w:t xml:space="preserve">Nicholson e Snyder (cap. 2), Simon e </w:t>
+            </w:r>
+            <w:proofErr w:type="spellStart"/>
+            <w:r>
+              <w:rPr>
+                <w:rFonts w:eastAsia="Arial Unicode MS"/>
+                <w:color w:val="000000"/>
+                <w:sz w:val="22"/>
+                <w:szCs w:val="22"/>
+              </w:rPr>
+              <w:t>Blume</w:t>
+            </w:r>
+            <w:proofErr w:type="spellEnd"/>
+            <w:r>
+              <w:rPr>
+                <w:rFonts w:eastAsia="Arial Unicode MS"/>
+                <w:color w:val="000000"/>
+                <w:sz w:val="22"/>
+                <w:szCs w:val="22"/>
+              </w:rPr>
+              <w:t xml:space="preserve"> (cap. 21)</w:t>
             </w:r>
           </w:p>
           <w:p>
@@ -3560,7 +4590,47 @@
                 <w:sz w:val="22"/>
                 <w:szCs w:val="22"/>
               </w:rPr>
-              <w:t>Leitura básica: Chiang e Wainwright (cap. 12)</w:t>
+              <w:t xml:space="preserve">Leitura básica: </w:t>
+            </w:r>
+            <w:proofErr w:type="spellStart"/>
+            <w:r>
+              <w:rPr>
+                <w:rFonts w:eastAsia="Arial Unicode MS"/>
+                <w:color w:val="000000"/>
+                <w:sz w:val="22"/>
+                <w:szCs w:val="22"/>
+              </w:rPr>
+              <w:t>Chiang</w:t>
+            </w:r>
+            <w:proofErr w:type="spellEnd"/>
+            <w:r>
+              <w:rPr>
+                <w:rFonts w:eastAsia="Arial Unicode MS"/>
+                <w:color w:val="000000"/>
+                <w:sz w:val="22"/>
+                <w:szCs w:val="22"/>
+              </w:rPr>
+              <w:t xml:space="preserve"> e </w:t>
+            </w:r>
+            <w:proofErr w:type="spellStart"/>
+            <w:r>
+              <w:rPr>
+                <w:rFonts w:eastAsia="Arial Unicode MS"/>
+                <w:color w:val="000000"/>
+                <w:sz w:val="22"/>
+                <w:szCs w:val="22"/>
+              </w:rPr>
+              <w:t>Wainwright</w:t>
+            </w:r>
+            <w:proofErr w:type="spellEnd"/>
+            <w:r>
+              <w:rPr>
+                <w:rFonts w:eastAsia="Arial Unicode MS"/>
+                <w:color w:val="000000"/>
+                <w:sz w:val="22"/>
+                <w:szCs w:val="22"/>
+              </w:rPr>
+              <w:t xml:space="preserve"> (cap. 12)</w:t>
             </w:r>
           </w:p>
           <w:p>
@@ -3580,7 +4650,27 @@
                 <w:sz w:val="22"/>
                 <w:szCs w:val="22"/>
               </w:rPr>
-              <w:t>Leitura complementar: Nicholson e Snyder (cap. 2), Simon e Blume (cap. 21)</w:t>
+              <w:t xml:space="preserve">Leitura complementar: Nicholson e Snyder (cap. 2), Simon e </w:t>
+            </w:r>
+            <w:proofErr w:type="spellStart"/>
+            <w:r>
+              <w:rPr>
+                <w:rFonts w:eastAsia="Arial Unicode MS"/>
+                <w:color w:val="000000"/>
+                <w:sz w:val="22"/>
+                <w:szCs w:val="22"/>
+              </w:rPr>
+              <w:t>Blume</w:t>
+            </w:r>
+            <w:proofErr w:type="spellEnd"/>
+            <w:r>
+              <w:rPr>
+                <w:rFonts w:eastAsia="Arial Unicode MS"/>
+                <w:color w:val="000000"/>
+                <w:sz w:val="22"/>
+                <w:szCs w:val="22"/>
+              </w:rPr>
+              <w:t xml:space="preserve"> (cap. 21)</w:t>
             </w:r>
           </w:p>
           <w:p>
@@ -3626,14 +4716,45 @@
               </w:rPr>
               <w:t xml:space="preserve">Leitura básica: </w:t>
             </w:r>
-            <w:r>
-              <w:rPr>
-                <w:rFonts w:eastAsia="Arial Unicode MS"/>
-                <w:color w:val="000000"/>
-                <w:sz w:val="22"/>
-                <w:szCs w:val="22"/>
-              </w:rPr>
-              <w:t>Chiang e Wainwright (cap. 13)</w:t>
+            <w:proofErr w:type="spellStart"/>
+            <w:r>
+              <w:rPr>
+                <w:rFonts w:eastAsia="Arial Unicode MS"/>
+                <w:color w:val="000000"/>
+                <w:sz w:val="22"/>
+                <w:szCs w:val="22"/>
+              </w:rPr>
+              <w:t>Chiang</w:t>
+            </w:r>
+            <w:proofErr w:type="spellEnd"/>
+            <w:r>
+              <w:rPr>
+                <w:rFonts w:eastAsia="Arial Unicode MS"/>
+                <w:color w:val="000000"/>
+                <w:sz w:val="22"/>
+                <w:szCs w:val="22"/>
+              </w:rPr>
+              <w:t xml:space="preserve"> e </w:t>
+            </w:r>
+            <w:proofErr w:type="spellStart"/>
+            <w:r>
+              <w:rPr>
+                <w:rFonts w:eastAsia="Arial Unicode MS"/>
+                <w:color w:val="000000"/>
+                <w:sz w:val="22"/>
+                <w:szCs w:val="22"/>
+              </w:rPr>
+              <w:t>Wainwright</w:t>
+            </w:r>
+            <w:proofErr w:type="spellEnd"/>
+            <w:r>
+              <w:rPr>
+                <w:rFonts w:eastAsia="Arial Unicode MS"/>
+                <w:color w:val="000000"/>
+                <w:sz w:val="22"/>
+                <w:szCs w:val="22"/>
+              </w:rPr>
+              <w:t xml:space="preserve"> (cap. 13)</w:t>
             </w:r>
           </w:p>
           <w:p>
@@ -3662,7 +4783,27 @@
                 <w:sz w:val="22"/>
                 <w:szCs w:val="22"/>
               </w:rPr>
-              <w:t>Nicholson e Snyder (cap. 2), Simon e Blume (cap. 21)</w:t>
+              <w:t xml:space="preserve">Nicholson e Snyder (cap. 2), Simon e </w:t>
+            </w:r>
+            <w:proofErr w:type="spellStart"/>
+            <w:r>
+              <w:rPr>
+                <w:rFonts w:eastAsia="Arial Unicode MS"/>
+                <w:color w:val="000000"/>
+                <w:sz w:val="22"/>
+                <w:szCs w:val="22"/>
+              </w:rPr>
+              <w:t>Blume</w:t>
+            </w:r>
+            <w:proofErr w:type="spellEnd"/>
+            <w:r>
+              <w:rPr>
+                <w:rFonts w:eastAsia="Arial Unicode MS"/>
+                <w:color w:val="000000"/>
+                <w:sz w:val="22"/>
+                <w:szCs w:val="22"/>
+              </w:rPr>
+              <w:t xml:space="preserve"> (cap. 21)</w:t>
             </w:r>
           </w:p>
           <w:p>
@@ -4364,12 +5505,40 @@
                 <w:szCs w:val="22"/>
                 <w:u w:val="single"/>
               </w:rPr>
-              <w:t>Observações gerais sobre normas e formas de avaliação</w:t>
+              <w:t>Da média semestral e da aprovação do estudante</w:t>
             </w:r>
           </w:p>
           <w:p>
             <w:pPr>
               <w:jc w:val="both"/>
+              <w:rPr>
+                <w:rFonts w:eastAsia="Arial Unicode MS"/>
+                <w:color w:val="000000"/>
+                <w:sz w:val="22"/>
+                <w:szCs w:val="22"/>
+              </w:rPr>
+            </w:pPr>
+            <w:r>
+              <w:rPr>
+                <w:rFonts w:eastAsia="Arial Unicode MS"/>
+                <w:color w:val="000000"/>
+                <w:sz w:val="22"/>
+                <w:szCs w:val="22"/>
+              </w:rPr>
+              <w:t>De acordo com a Instrução Normativa nº 006, de 13 de julho de 2026:</w:t>
+            </w:r>
+          </w:p>
+          <w:p>
+            <w:pPr>
+              <w:jc w:val="both"/>
+              <w:rPr>
+                <w:rFonts w:eastAsia="Arial Unicode MS"/>
+                <w:color w:val="000000"/>
+                <w:sz w:val="22"/>
+                <w:szCs w:val="22"/>
+              </w:rPr>
+            </w:pPr>
+            <w:r>
               <w:rPr>
                 <w:rFonts w:eastAsia="Arial Unicode MS"/>
                 <w:b/>
@@ -4378,16 +5547,351 @@
                 <w:sz w:val="22"/>
                 <w:szCs w:val="22"/>
               </w:rPr>
-            </w:pPr>
-            <w:r>
-              <w:rPr>
-                <w:rFonts w:eastAsia="Arial Unicode MS"/>
-                <w:color w:val="000000"/>
-                <w:sz w:val="22"/>
-                <w:szCs w:val="22"/>
-              </w:rPr>
-              <w:t>Em caso de alteração nas normativas da UDESC, poderão ser adotadas diferentes formas de avaliação, sempre em conformidade com os calendários e as normas vigentes, bem como com as condições institucionais da Universidade.</w:t>
-            </w:r>
+              <w:t xml:space="preserve">Art. 5º </w:t>
+            </w:r>
+            <w:r>
+              <w:rPr>
+                <w:rFonts w:eastAsia="Arial Unicode MS"/>
+                <w:color w:val="000000"/>
+                <w:sz w:val="22"/>
+                <w:szCs w:val="22"/>
+              </w:rPr>
+              <w:t xml:space="preserve">Será considerado aprovado no componente curricular o estudante que obtiver média final semestral igual ou superior a 6,0 (seis) e atender </w:t>
+            </w:r>
+            <w:r>
+              <w:rPr>
+                <w:rFonts w:eastAsia="Arial Unicode MS"/>
+                <w:color w:val="000000"/>
+                <w:sz w:val="22"/>
+                <w:szCs w:val="22"/>
+              </w:rPr>
+              <w:t>a</w:t>
+            </w:r>
+            <w:r>
+              <w:rPr>
+                <w:rFonts w:eastAsia="Arial Unicode MS"/>
+                <w:color w:val="000000"/>
+                <w:sz w:val="22"/>
+                <w:szCs w:val="22"/>
+              </w:rPr>
+              <w:t>os critérios de frequência estabelecidos pela legislação vigente.</w:t>
+            </w:r>
+          </w:p>
+          <w:p>
+            <w:pPr>
+              <w:jc w:val="both"/>
+              <w:rPr>
+                <w:rFonts w:eastAsia="Arial Unicode MS"/>
+                <w:color w:val="000000"/>
+                <w:sz w:val="22"/>
+                <w:szCs w:val="22"/>
+              </w:rPr>
+            </w:pPr>
+          </w:p>
+          <w:p>
+            <w:pPr>
+              <w:jc w:val="both"/>
+              <w:rPr>
+                <w:rFonts w:eastAsia="Arial Unicode MS"/>
+                <w:b/>
+                <w:bCs/>
+                <w:color w:val="000000"/>
+                <w:sz w:val="22"/>
+                <w:szCs w:val="22"/>
+                <w:u w:val="single"/>
+              </w:rPr>
+            </w:pPr>
+            <w:r>
+              <w:rPr>
+                <w:rFonts w:eastAsia="Arial Unicode MS"/>
+                <w:b/>
+                <w:bCs/>
+                <w:color w:val="000000"/>
+                <w:sz w:val="22"/>
+                <w:szCs w:val="22"/>
+                <w:u w:val="single"/>
+              </w:rPr>
+              <w:t>Da recuperação da aprendizagem dos conceitos e conteúdos</w:t>
+            </w:r>
+          </w:p>
+          <w:p>
+            <w:pPr>
+              <w:jc w:val="both"/>
+              <w:rPr>
+                <w:rFonts w:eastAsia="Arial Unicode MS"/>
+                <w:color w:val="000000"/>
+                <w:sz w:val="22"/>
+                <w:szCs w:val="22"/>
+              </w:rPr>
+            </w:pPr>
+            <w:r>
+              <w:rPr>
+                <w:rFonts w:eastAsia="Arial Unicode MS"/>
+                <w:b/>
+                <w:bCs/>
+                <w:color w:val="000000"/>
+                <w:sz w:val="22"/>
+                <w:szCs w:val="22"/>
+              </w:rPr>
+              <w:t xml:space="preserve">Art. 7º </w:t>
+            </w:r>
+            <w:r>
+              <w:rPr>
+                <w:rFonts w:eastAsia="Arial Unicode MS"/>
+                <w:color w:val="000000"/>
+                <w:sz w:val="22"/>
+                <w:szCs w:val="22"/>
+              </w:rPr>
+              <w:t>A recuperação</w:t>
+            </w:r>
+            <w:r>
+              <w:rPr>
+                <w:rFonts w:eastAsia="Arial Unicode MS"/>
+                <w:color w:val="000000"/>
+                <w:sz w:val="22"/>
+                <w:szCs w:val="22"/>
+              </w:rPr>
+              <w:t xml:space="preserve"> da aprendizagem</w:t>
+            </w:r>
+            <w:r>
+              <w:rPr>
+                <w:rFonts w:eastAsia="Arial Unicode MS"/>
+                <w:color w:val="000000"/>
+                <w:sz w:val="22"/>
+                <w:szCs w:val="22"/>
+              </w:rPr>
+              <w:t xml:space="preserve"> ocorre durante o período letivo, simultaneamente ao processo de ensino-aprendizagem. As estratégias, os instrumentos e os critérios de avaliação utilizados no processo de recuperação da aprendizagem não poderão resultar em diminuição de nota ou média final semestral dos estudantes.</w:t>
+            </w:r>
+          </w:p>
+          <w:p>
+            <w:pPr>
+              <w:jc w:val="both"/>
+              <w:rPr>
+                <w:rFonts w:eastAsia="Arial Unicode MS"/>
+                <w:color w:val="000000"/>
+                <w:sz w:val="22"/>
+                <w:szCs w:val="22"/>
+              </w:rPr>
+            </w:pPr>
+          </w:p>
+          <w:p>
+            <w:pPr>
+              <w:jc w:val="both"/>
+              <w:rPr>
+                <w:rFonts w:eastAsia="Arial Unicode MS"/>
+                <w:color w:val="000000"/>
+                <w:sz w:val="22"/>
+                <w:szCs w:val="22"/>
+              </w:rPr>
+            </w:pPr>
+            <w:r>
+              <w:rPr>
+                <w:rFonts w:eastAsia="Arial Unicode MS"/>
+                <w:b/>
+                <w:bCs/>
+                <w:color w:val="000000"/>
+                <w:sz w:val="22"/>
+                <w:szCs w:val="22"/>
+              </w:rPr>
+              <w:lastRenderedPageBreak/>
+              <w:t>Art. 10</w:t>
+            </w:r>
+            <w:r>
+              <w:rPr>
+                <w:rFonts w:eastAsia="Arial Unicode MS"/>
+                <w:b/>
+                <w:bCs/>
+                <w:color w:val="000000"/>
+                <w:sz w:val="22"/>
+                <w:szCs w:val="22"/>
+              </w:rPr>
+              <w:t xml:space="preserve"> </w:t>
+            </w:r>
+            <w:r>
+              <w:rPr>
+                <w:rFonts w:eastAsia="Arial Unicode MS"/>
+                <w:color w:val="000000"/>
+                <w:sz w:val="22"/>
+                <w:szCs w:val="22"/>
+              </w:rPr>
+              <w:t>Para a recuperação da aprendizagem, observados os objetivos previstos nesse Plano de Ensino e as orientações constantes no Anexo I da Instrução Normativa nº 006/2026, será adotada a estratégia correspondente ao inciso II do Art. 10:</w:t>
+            </w:r>
+          </w:p>
+          <w:p>
+            <w:pPr>
+              <w:pStyle w:val="PargrafodaLista"/>
+              <w:numPr>
+                <w:ilvl w:val="0"/>
+                <w:numId w:val="23"/>
+              </w:numPr>
+              <w:jc w:val="both"/>
+              <w:rPr>
+                <w:rFonts w:eastAsia="Arial Unicode MS"/>
+                <w:color w:val="000000"/>
+                <w:sz w:val="22"/>
+                <w:szCs w:val="22"/>
+              </w:rPr>
+            </w:pPr>
+            <w:r>
+              <w:rPr>
+                <w:rFonts w:eastAsia="Arial Unicode MS"/>
+                <w:color w:val="000000"/>
+                <w:sz w:val="22"/>
+                <w:szCs w:val="22"/>
+              </w:rPr>
+              <w:t>A recuperação da aprendizagem consistirá em uma avaliação complementar única, de conteúdo abrangendo todo o semestre, a ser realizada ao final do período letivo, antes do encerramento do semestre.</w:t>
+            </w:r>
+          </w:p>
+          <w:p>
+            <w:pPr>
+              <w:pStyle w:val="PargrafodaLista"/>
+              <w:numPr>
+                <w:ilvl w:val="0"/>
+                <w:numId w:val="23"/>
+              </w:numPr>
+              <w:jc w:val="both"/>
+              <w:rPr>
+                <w:rFonts w:eastAsia="Arial Unicode MS"/>
+                <w:color w:val="000000"/>
+                <w:sz w:val="22"/>
+                <w:szCs w:val="22"/>
+              </w:rPr>
+            </w:pPr>
+            <w:r>
+              <w:rPr>
+                <w:rFonts w:eastAsia="Arial Unicode MS"/>
+                <w:color w:val="000000"/>
+                <w:sz w:val="22"/>
+                <w:szCs w:val="22"/>
+              </w:rPr>
+              <w:t>Essa avaliação será oferecida exclusivamente aos estudantes que não atingirem média final semestral igual ou superior a 6,0 (seis) nos instrumentos avaliativos regulares descritos acima.</w:t>
+            </w:r>
+          </w:p>
+          <w:p>
+            <w:pPr>
+              <w:pStyle w:val="PargrafodaLista"/>
+              <w:numPr>
+                <w:ilvl w:val="0"/>
+                <w:numId w:val="23"/>
+              </w:numPr>
+              <w:jc w:val="both"/>
+              <w:rPr>
+                <w:rFonts w:eastAsia="Arial Unicode MS"/>
+                <w:color w:val="000000"/>
+                <w:sz w:val="22"/>
+                <w:szCs w:val="22"/>
+              </w:rPr>
+            </w:pPr>
+            <w:r>
+              <w:rPr>
+                <w:rFonts w:eastAsia="Arial Unicode MS"/>
+                <w:color w:val="000000"/>
+                <w:sz w:val="22"/>
+                <w:szCs w:val="22"/>
+              </w:rPr>
+              <w:t>A nota final do componente curricular passará a ser a média entre a média semestral originalmente obtida pelo estudante e a nota da avaliação complementar. Essa substituição somente será aplicada caso resulte em nota superior à média originalmente alcançada; caso contrário, prevalecerá esta última, conforme parágrafo único do Art. 10 da Instrução Normativa nº 006/2026.</w:t>
+            </w:r>
+          </w:p>
+          <w:p>
+            <w:pPr>
+              <w:pStyle w:val="PargrafodaLista"/>
+              <w:numPr>
+                <w:ilvl w:val="0"/>
+                <w:numId w:val="23"/>
+              </w:numPr>
+              <w:jc w:val="both"/>
+              <w:rPr>
+                <w:rFonts w:eastAsia="Arial Unicode MS"/>
+                <w:color w:val="000000"/>
+                <w:sz w:val="22"/>
+                <w:szCs w:val="22"/>
+              </w:rPr>
+            </w:pPr>
+            <w:r>
+              <w:rPr>
+                <w:rFonts w:eastAsia="Arial Unicode MS"/>
+                <w:color w:val="000000"/>
+                <w:sz w:val="22"/>
+                <w:szCs w:val="22"/>
+              </w:rPr>
+              <w:t>Fórmula: Nota final = (Média semestral original + Nota da avaliação complementar) ÷ 2, aplicada somente se resultar em valor superior à média original.</w:t>
+            </w:r>
+          </w:p>
+          <w:p>
+            <w:pPr>
+              <w:jc w:val="both"/>
+              <w:rPr>
+                <w:rFonts w:eastAsia="Arial Unicode MS"/>
+                <w:b/>
+                <w:bCs/>
+                <w:color w:val="000000"/>
+                <w:sz w:val="22"/>
+                <w:szCs w:val="22"/>
+              </w:rPr>
+            </w:pPr>
+            <w:r>
+              <w:rPr>
+                <w:rFonts w:eastAsia="Arial Unicode MS"/>
+                <w:i/>
+                <w:iCs/>
+                <w:color w:val="000000"/>
+                <w:sz w:val="22"/>
+                <w:szCs w:val="22"/>
+              </w:rPr>
+              <w:t xml:space="preserve">Leia a </w:t>
+            </w:r>
+            <w:r>
+              <w:rPr>
+                <w:rFonts w:eastAsia="Arial Unicode MS"/>
+                <w:i/>
+                <w:iCs/>
+                <w:color w:val="000000"/>
+                <w:sz w:val="22"/>
+                <w:szCs w:val="22"/>
+              </w:rPr>
+              <w:t>instrução normativa</w:t>
+            </w:r>
+            <w:r>
+              <w:rPr>
+                <w:rFonts w:eastAsia="Arial Unicode MS"/>
+                <w:i/>
+                <w:iCs/>
+                <w:color w:val="000000"/>
+                <w:sz w:val="22"/>
+                <w:szCs w:val="22"/>
+              </w:rPr>
+              <w:t xml:space="preserve"> na íntegra n</w:t>
+            </w:r>
+            <w:r>
+              <w:rPr>
+                <w:rFonts w:eastAsia="Arial Unicode MS"/>
+                <w:i/>
+                <w:iCs/>
+                <w:color w:val="000000"/>
+                <w:sz w:val="22"/>
+                <w:szCs w:val="22"/>
+              </w:rPr>
+              <w:t>o link</w:t>
+            </w:r>
+            <w:r>
+              <w:rPr>
+                <w:rFonts w:eastAsia="Arial Unicode MS"/>
+                <w:i/>
+                <w:iCs/>
+                <w:color w:val="000000"/>
+                <w:sz w:val="22"/>
+                <w:szCs w:val="22"/>
+              </w:rPr>
+              <w:t xml:space="preserve">: </w:t>
+            </w:r>
+            <w:hyperlink r:id="rId6" w:history="1">
+              <w:r>
+                <w:rPr>
+                  <w:rStyle w:val="Hyperlink"/>
+                </w:rPr>
+                <w:t>Processo_UDESC_00026576_2026_17839795699058_21414.pdf</w:t>
+              </w:r>
+            </w:hyperlink>
           </w:p>
         </w:tc>
       </w:tr>
@@ -4582,17 +6086,7 @@
           <w:sz w:val="22"/>
           <w:szCs w:val="22"/>
         </w:rPr>
-        <w:t xml:space="preserve">através de requerimento por ele assinado, ou por seu representante legal, entregue </w:t>
-      </w:r>
-      <w:r>
-        <w:rPr>
-          <w:rFonts w:eastAsia="Arial Unicode MS"/>
-          <w:color w:val="000000"/>
-          <w:sz w:val="22"/>
-          <w:szCs w:val="22"/>
-        </w:rPr>
-        <w:lastRenderedPageBreak/>
-        <w:t xml:space="preserve">na Secretaria de Ensino de Graduação e/ou Secretaria do Departamento, no </w:t>
+        <w:t xml:space="preserve">através de requerimento por ele assinado, ou por seu representante legal, entregue na Secretaria de Ensino de Graduação e/ou Secretaria do Departamento, no </w:t>
       </w:r>
       <w:r>
         <w:rPr>
@@ -4632,9 +6126,19 @@
           <w:sz w:val="22"/>
           <w:szCs w:val="22"/>
         </w:rPr>
-        <w:t xml:space="preserve">I - </w:t>
+        <w:t xml:space="preserve">I - problema de saúde do aluno ou parente de 1º grau, devidamente comprovado, que justifique a ausência; </w:t>
       </w:r>
-      <w:proofErr w:type="gramStart"/>
+    </w:p>
+    <w:p>
+      <w:pPr>
+        <w:jc w:val="both"/>
+        <w:rPr>
+          <w:rFonts w:eastAsia="Arial Unicode MS"/>
+          <w:color w:val="000000"/>
+          <w:sz w:val="22"/>
+          <w:szCs w:val="22"/>
+        </w:rPr>
+      </w:pPr>
       <w:r>
         <w:rPr>
           <w:rFonts w:eastAsia="Arial Unicode MS"/>
@@ -4642,57 +6146,7 @@
           <w:sz w:val="22"/>
           <w:szCs w:val="22"/>
         </w:rPr>
-        <w:t>problema</w:t>
-      </w:r>
-      <w:proofErr w:type="gramEnd"/>
-      <w:r>
-        <w:rPr>
-          <w:rFonts w:eastAsia="Arial Unicode MS"/>
-          <w:color w:val="000000"/>
-          <w:sz w:val="22"/>
-          <w:szCs w:val="22"/>
-        </w:rPr>
-        <w:t xml:space="preserve"> de saúde do aluno ou parente de 1º grau, devidamente comprovado, que justifique a ausência; </w:t>
-      </w:r>
-    </w:p>
-    <w:p>
-      <w:pPr>
-        <w:jc w:val="both"/>
-        <w:rPr>
-          <w:rFonts w:eastAsia="Arial Unicode MS"/>
-          <w:color w:val="000000"/>
-          <w:sz w:val="22"/>
-          <w:szCs w:val="22"/>
-        </w:rPr>
-      </w:pPr>
-      <w:r>
-        <w:rPr>
-          <w:rFonts w:eastAsia="Arial Unicode MS"/>
-          <w:color w:val="000000"/>
-          <w:sz w:val="22"/>
-          <w:szCs w:val="22"/>
-        </w:rPr>
-        <w:t xml:space="preserve">II - </w:t>
-      </w:r>
-      <w:proofErr w:type="gramStart"/>
-      <w:r>
-        <w:rPr>
-          <w:rFonts w:eastAsia="Arial Unicode MS"/>
-          <w:color w:val="000000"/>
-          <w:sz w:val="22"/>
-          <w:szCs w:val="22"/>
-        </w:rPr>
-        <w:t>ter</w:t>
-      </w:r>
-      <w:proofErr w:type="gramEnd"/>
-      <w:r>
-        <w:rPr>
-          <w:rFonts w:eastAsia="Arial Unicode MS"/>
-          <w:color w:val="000000"/>
-          <w:sz w:val="22"/>
-          <w:szCs w:val="22"/>
-        </w:rPr>
-        <w:t xml:space="preserve"> sido vítima de ação involuntária provocada por terceiros, comprovada por Boletim de Ocorrência ou documento equivalente; </w:t>
+        <w:t xml:space="preserve">II - ter sido vítima de ação involuntária provocada por terceiros, comprovada por Boletim de Ocorrência ou documento equivalente; </w:t>
       </w:r>
     </w:p>
     <w:p>
@@ -4732,9 +6186,19 @@
           <w:sz w:val="22"/>
           <w:szCs w:val="22"/>
         </w:rPr>
-        <w:t xml:space="preserve">IV - </w:t>
+        <w:t xml:space="preserve">IV - luto, comprovado pelo respectivo atestado de óbito, por parentes em linha reta (pais, avós, filhos e netos), colaterais até o segundo grau (irmãos e tios), cônjuge ou companheiro (a), com prazo de até 5 (cinco) dias úteis após o óbito; </w:t>
       </w:r>
-      <w:proofErr w:type="gramStart"/>
+    </w:p>
+    <w:p>
+      <w:pPr>
+        <w:jc w:val="both"/>
+        <w:rPr>
+          <w:rFonts w:eastAsia="Arial Unicode MS"/>
+          <w:color w:val="000000"/>
+          <w:sz w:val="22"/>
+          <w:szCs w:val="22"/>
+        </w:rPr>
+      </w:pPr>
       <w:r>
         <w:rPr>
           <w:rFonts w:eastAsia="Arial Unicode MS"/>
@@ -4742,9 +6206,19 @@
           <w:sz w:val="22"/>
           <w:szCs w:val="22"/>
         </w:rPr>
-        <w:t>luto</w:t>
+        <w:t xml:space="preserve">V - convocação, coincidente em horário, para depoimento judicial ou policial, ou para eleições em entidades oficiais, devidamente comprovada por declaração da autoridade competente; </w:t>
       </w:r>
-      <w:proofErr w:type="gramEnd"/>
+    </w:p>
+    <w:p>
+      <w:pPr>
+        <w:jc w:val="both"/>
+        <w:rPr>
+          <w:rFonts w:eastAsia="Arial Unicode MS"/>
+          <w:color w:val="000000"/>
+          <w:sz w:val="22"/>
+          <w:szCs w:val="22"/>
+        </w:rPr>
+      </w:pPr>
       <w:r>
         <w:rPr>
           <w:rFonts w:eastAsia="Arial Unicode MS"/>
@@ -4752,87 +6226,7 @@
           <w:sz w:val="22"/>
           <w:szCs w:val="22"/>
         </w:rPr>
-        <w:t xml:space="preserve">, comprovado pelo respectivo atestado de óbito, por parentes em linha reta (pais, avós, filhos e netos), colaterais até o segundo grau (irmãos e tios), cônjuge ou companheiro (a), com prazo de até 5 (cinco) dias úteis após o óbito; </w:t>
-      </w:r>
-    </w:p>
-    <w:p>
-      <w:pPr>
-        <w:jc w:val="both"/>
-        <w:rPr>
-          <w:rFonts w:eastAsia="Arial Unicode MS"/>
-          <w:color w:val="000000"/>
-          <w:sz w:val="22"/>
-          <w:szCs w:val="22"/>
-        </w:rPr>
-      </w:pPr>
-      <w:r>
-        <w:rPr>
-          <w:rFonts w:eastAsia="Arial Unicode MS"/>
-          <w:color w:val="000000"/>
-          <w:sz w:val="22"/>
-          <w:szCs w:val="22"/>
-        </w:rPr>
-        <w:t xml:space="preserve">V - </w:t>
-      </w:r>
-      <w:proofErr w:type="gramStart"/>
-      <w:r>
-        <w:rPr>
-          <w:rFonts w:eastAsia="Arial Unicode MS"/>
-          <w:color w:val="000000"/>
-          <w:sz w:val="22"/>
-          <w:szCs w:val="22"/>
-        </w:rPr>
-        <w:t>convocação</w:t>
-      </w:r>
-      <w:proofErr w:type="gramEnd"/>
-      <w:r>
-        <w:rPr>
-          <w:rFonts w:eastAsia="Arial Unicode MS"/>
-          <w:color w:val="000000"/>
-          <w:sz w:val="22"/>
-          <w:szCs w:val="22"/>
-        </w:rPr>
-        <w:t xml:space="preserve">, coincidente em horário, para depoimento judicial ou policial, ou para eleições em entidades oficiais, devidamente comprovada por declaração da autoridade competente; </w:t>
-      </w:r>
-    </w:p>
-    <w:p>
-      <w:pPr>
-        <w:jc w:val="both"/>
-        <w:rPr>
-          <w:rFonts w:eastAsia="Arial Unicode MS"/>
-          <w:color w:val="000000"/>
-          <w:sz w:val="22"/>
-          <w:szCs w:val="22"/>
-        </w:rPr>
-      </w:pPr>
-      <w:r>
-        <w:rPr>
-          <w:rFonts w:eastAsia="Arial Unicode MS"/>
-          <w:color w:val="000000"/>
-          <w:sz w:val="22"/>
-          <w:szCs w:val="22"/>
-        </w:rPr>
-        <w:t xml:space="preserve">VI - </w:t>
-      </w:r>
-      <w:proofErr w:type="gramStart"/>
-      <w:r>
-        <w:rPr>
-          <w:rFonts w:eastAsia="Arial Unicode MS"/>
-          <w:color w:val="000000"/>
-          <w:sz w:val="22"/>
-          <w:szCs w:val="22"/>
-        </w:rPr>
-        <w:t>impedimentos</w:t>
-      </w:r>
-      <w:proofErr w:type="gramEnd"/>
-      <w:r>
-        <w:rPr>
-          <w:rFonts w:eastAsia="Arial Unicode MS"/>
-          <w:color w:val="000000"/>
-          <w:sz w:val="22"/>
-          <w:szCs w:val="22"/>
-        </w:rPr>
-        <w:t xml:space="preserve"> gerados por atividades previstas e autorizadas pela Chefia de Departamento do respectivo curso ou instância hierárquica superior, comprovada através de declaração ou documento equivalente; </w:t>
+        <w:t xml:space="preserve">VI - impedimentos gerados por atividades previstas e autorizadas pela Chefia de Departamento do respectivo curso ou instância hierárquica superior, comprovada através de declaração ou documento equivalente; </w:t>
       </w:r>
     </w:p>
     <w:p>
@@ -4892,9 +6286,19 @@
           <w:sz w:val="22"/>
           <w:szCs w:val="22"/>
         </w:rPr>
-        <w:t xml:space="preserve">IX – </w:t>
+        <w:t xml:space="preserve">IX – convocação para competições oficiais representando a UDESC, o Município, o Estado ou o País; </w:t>
       </w:r>
-      <w:proofErr w:type="gramStart"/>
+    </w:p>
+    <w:p>
+      <w:pPr>
+        <w:jc w:val="both"/>
+        <w:rPr>
+          <w:rFonts w:eastAsia="Arial Unicode MS"/>
+          <w:color w:val="000000"/>
+          <w:sz w:val="22"/>
+          <w:szCs w:val="22"/>
+        </w:rPr>
+      </w:pPr>
       <w:r>
         <w:rPr>
           <w:rFonts w:eastAsia="Arial Unicode MS"/>
@@ -4902,57 +6306,7 @@
           <w:sz w:val="22"/>
           <w:szCs w:val="22"/>
         </w:rPr>
-        <w:t>convocação</w:t>
-      </w:r>
-      <w:proofErr w:type="gramEnd"/>
-      <w:r>
-        <w:rPr>
-          <w:rFonts w:eastAsia="Arial Unicode MS"/>
-          <w:color w:val="000000"/>
-          <w:sz w:val="22"/>
-          <w:szCs w:val="22"/>
-        </w:rPr>
-        <w:t xml:space="preserve"> para competições oficiais representando a UDESC, o Município, o Estado ou o País; </w:t>
-      </w:r>
-    </w:p>
-    <w:p>
-      <w:pPr>
-        <w:jc w:val="both"/>
-        <w:rPr>
-          <w:rFonts w:eastAsia="Arial Unicode MS"/>
-          <w:color w:val="000000"/>
-          <w:sz w:val="22"/>
-          <w:szCs w:val="22"/>
-        </w:rPr>
-      </w:pPr>
-      <w:r>
-        <w:rPr>
-          <w:rFonts w:eastAsia="Arial Unicode MS"/>
-          <w:color w:val="000000"/>
-          <w:sz w:val="22"/>
-          <w:szCs w:val="22"/>
-        </w:rPr>
-        <w:t xml:space="preserve">X – </w:t>
-      </w:r>
-      <w:proofErr w:type="gramStart"/>
-      <w:r>
-        <w:rPr>
-          <w:rFonts w:eastAsia="Arial Unicode MS"/>
-          <w:color w:val="000000"/>
-          <w:sz w:val="22"/>
-          <w:szCs w:val="22"/>
-        </w:rPr>
-        <w:t>convocação</w:t>
-      </w:r>
-      <w:proofErr w:type="gramEnd"/>
-      <w:r>
-        <w:rPr>
-          <w:rFonts w:eastAsia="Arial Unicode MS"/>
-          <w:color w:val="000000"/>
-          <w:sz w:val="22"/>
-          <w:szCs w:val="22"/>
-        </w:rPr>
-        <w:t xml:space="preserve"> pelo chefe imediato, no caso de acadêmico que trabalhe, em documento devidamente assinado e carimbado, contendo CNPJ da empresa ou equivalente, acompanhado de documento anexo que comprove o vínculo empregatício, como cópia da carteira de trabalho ou do contrato ou de documento</w:t>
+        <w:t>X – convocação pelo chefe imediato, no caso de acadêmico que trabalhe, em documento devidamente assinado e carimbado, contendo CNPJ da empresa ou equivalente, acompanhado de documento anexo que comprove o vínculo empregatício, como cópia da carteira de trabalho ou do contrato ou de documento</w:t>
       </w:r>
       <w:r>
         <w:rPr>
@@ -5015,7 +6369,7 @@
         </w:rPr>
         <w:t xml:space="preserve">Leia a resolução na íntegra na página da Secretaria dos Conselhos: </w:t>
       </w:r>
-      <w:hyperlink r:id="rId6" w:history="1">
+      <w:hyperlink r:id="rId7" w:history="1">
         <w:r>
           <w:rPr>
             <w:rStyle w:val="Hyperlink"/>
@@ -5063,6 +6417,7 @@
           <w:szCs w:val="22"/>
           <w:u w:val="single"/>
         </w:rPr>
+        <w:lastRenderedPageBreak/>
         <w:t>Observação sobre utilização de IA na disciplina</w:t>
       </w:r>
     </w:p>
@@ -5535,7 +6890,6 @@
                 <w:sz w:val="22"/>
                 <w:szCs w:val="22"/>
               </w:rPr>
-              <w:lastRenderedPageBreak/>
               <w:t xml:space="preserve">NICHOLSON, W.; SNYDER C. </w:t>
             </w:r>
             <w:r>
@@ -5576,9 +6930,29 @@
                 <w:sz w:val="22"/>
                 <w:szCs w:val="22"/>
               </w:rPr>
-              <w:t xml:space="preserve"> Cengage Learning Brasil, 2019. Disponível em: </w:t>
-            </w:r>
-            <w:hyperlink r:id="rId7" w:anchor="/books/9788522127030/" w:history="1">
+              <w:t xml:space="preserve"> </w:t>
+            </w:r>
+            <w:proofErr w:type="spellStart"/>
+            <w:r>
+              <w:rPr>
+                <w:rFonts w:eastAsia="Arial Unicode MS"/>
+                <w:color w:val="000000"/>
+                <w:sz w:val="22"/>
+                <w:szCs w:val="22"/>
+              </w:rPr>
+              <w:t>Cengage</w:t>
+            </w:r>
+            <w:proofErr w:type="spellEnd"/>
+            <w:r>
+              <w:rPr>
+                <w:rFonts w:eastAsia="Arial Unicode MS"/>
+                <w:color w:val="000000"/>
+                <w:sz w:val="22"/>
+                <w:szCs w:val="22"/>
+              </w:rPr>
+              <w:t xml:space="preserve"> Learning Brasil, 2019. Disponível em: </w:t>
+            </w:r>
+            <w:hyperlink r:id="rId8" w:anchor="/books/9788522127030/" w:history="1">
               <w:r>
                 <w:rPr>
                   <w:rStyle w:val="Hyperlink"/>
@@ -5620,6 +6994,7 @@
               </w:rPr>
               <w:t xml:space="preserve">STEWART, J. </w:t>
             </w:r>
+            <w:proofErr w:type="spellStart"/>
             <w:r>
               <w:rPr>
                 <w:rFonts w:eastAsia="Arial Unicode MS"/>
@@ -5632,6 +7007,7 @@
               </w:rPr>
               <w:t>Cálculo</w:t>
             </w:r>
+            <w:proofErr w:type="spellEnd"/>
             <w:r>
               <w:rPr>
                 <w:rFonts w:eastAsia="Arial Unicode MS"/>
@@ -5674,7 +7050,29 @@
                 <w:szCs w:val="22"/>
                 <w:lang w:val="en-US"/>
               </w:rPr>
-              <w:t xml:space="preserve">8.ed. Cengage Learning Brasil, 2017. </w:t>
+              <w:t xml:space="preserve">8.ed. Cengage Learning </w:t>
+            </w:r>
+            <w:proofErr w:type="spellStart"/>
+            <w:r>
+              <w:rPr>
+                <w:rFonts w:eastAsia="Arial Unicode MS"/>
+                <w:color w:val="000000"/>
+                <w:sz w:val="22"/>
+                <w:szCs w:val="22"/>
+                <w:lang w:val="en-US"/>
+              </w:rPr>
+              <w:t>Brasil</w:t>
+            </w:r>
+            <w:proofErr w:type="spellEnd"/>
+            <w:r>
+              <w:rPr>
+                <w:rFonts w:eastAsia="Arial Unicode MS"/>
+                <w:color w:val="000000"/>
+                <w:sz w:val="22"/>
+                <w:szCs w:val="22"/>
+                <w:lang w:val="en-US"/>
+              </w:rPr>
+              <w:t xml:space="preserve">, 2017. </w:t>
             </w:r>
             <w:r>
               <w:rPr>
@@ -5685,7 +7083,7 @@
               </w:rPr>
               <w:t xml:space="preserve">Disponível em: </w:t>
             </w:r>
-            <w:hyperlink r:id="rId8" w:anchor="/books/9788522126859/" w:history="1">
+            <w:hyperlink r:id="rId9" w:anchor="/books/9788522126859/" w:history="1">
               <w:r>
                 <w:rPr>
                   <w:rStyle w:val="Hyperlink"/>
@@ -5783,7 +7181,27 @@
                 <w:sz w:val="22"/>
                 <w:szCs w:val="22"/>
               </w:rPr>
-              <w:t xml:space="preserve"> 8.ed. Cengage Learning Brasil, 2017. Disponível em: </w:t>
+              <w:t xml:space="preserve"> 8.ed. </w:t>
+            </w:r>
+            <w:proofErr w:type="spellStart"/>
+            <w:r>
+              <w:rPr>
+                <w:rFonts w:eastAsia="Arial Unicode MS"/>
+                <w:color w:val="000000"/>
+                <w:sz w:val="22"/>
+                <w:szCs w:val="22"/>
+              </w:rPr>
+              <w:t>Cengage</w:t>
+            </w:r>
+            <w:proofErr w:type="spellEnd"/>
+            <w:r>
+              <w:rPr>
+                <w:rFonts w:eastAsia="Arial Unicode MS"/>
+                <w:color w:val="000000"/>
+                <w:sz w:val="22"/>
+                <w:szCs w:val="22"/>
+              </w:rPr>
+              <w:t xml:space="preserve"> Learning Brasil, 2017. Disponível em: </w:t>
             </w:r>
             <w:r>
               <w:rPr>
@@ -5861,6 +7279,118 @@
 <file path=word/numbering.xml><?xml version="1.0" encoding="utf-8"?>
 <w:numbering xmlns:wpc="http://schemas.microsoft.com/office/word/2010/wordprocessingCanvas" xmlns:cx="http://schemas.microsoft.com/office/drawing/2014/chartex" xmlns:cx1="http://schemas.microsoft.com/office/drawing/2015/9/8/chartex" xmlns:cx2="http://schemas.microsoft.com/office/drawing/2015/10/21/chartex" xmlns:cx3="http://schemas.microsoft.com/office/drawing/2016/5/9/chartex" xmlns:cx4="http://schemas.microsoft.com/office/drawing/2016/5/10/chartex" xmlns:cx5="http://schemas.microsoft.com/office/drawing/2016/5/11/chartex" xmlns:cx6="http://schemas.microsoft.com/office/drawing/2016/5/12/chartex" xmlns:cx7="http://schemas.microsoft.com/office/drawing/2016/5/13/chartex" xmlns:cx8="http://schemas.microsoft.com/office/drawing/2016/5/14/chartex" xmlns:mc="http://schemas.openxmlformats.org/markup-compatibility/2006" xmlns:aink="http://schemas.microsoft.com/office/drawing/2016/ink" xmlns:am3d="http://schemas.microsoft.com/office/drawing/2017/model3d" xmlns:o="urn:schemas-microsoft-com:office:office" xmlns:r="http://schemas.openxmlformats.org/officeDocument/2006/relationships" xmlns:m="http://schemas.openxmlformats.org/officeDocument/2006/math" xmlns:v="urn:schemas-microsoft-com:vml" xmlns:wp14="http://schemas.microsoft.com/office/word/2010/wordprocessingDrawing" xmlns:wp="http://schemas.openxmlformats.org/drawingml/2006/wordprocessingDrawing" xmlns:w10="urn:schemas-microsoft-com:office:word" xmlns:w="http://schemas.openxmlformats.org/wordprocessingml/2006/main" xmlns:w14="http://schemas.microsoft.com/office/word/2010/wordml" xmlns:w15="http://schemas.microsoft.com/office/word/2012/wordml" xmlns:w16cex="http://schemas.microsoft.com/office/word/2018/wordml/cex" xmlns:w16cid="http://schemas.microsoft.com/office/word/2016/wordml/cid" xmlns:w16="http://schemas.microsoft.com/office/word/2018/wordml" xmlns:w16sdtdh="http://schemas.microsoft.com/office/word/2020/wordml/sdtdatahash" xmlns:w16se="http://schemas.microsoft.com/office/word/2015/wordml/symex" xmlns:wpg="http://schemas.microsoft.com/office/word/2010/wordprocessingGroup" xmlns:wpi="http://schemas.microsoft.com/office/word/2010/wordprocessingInk" xmlns:wne="http://schemas.microsoft.com/office/word/2006/wordml" xmlns:wps="http://schemas.microsoft.com/office/word/2010/wordprocessingShape" mc:Ignorable="w14 w15 w16se w16cid w16 w16cex w16sdtdh wp14">
   <w:abstractNum w:abstractNumId="0" w15:restartNumberingAfterBreak="0">
+    <w:nsid w:val="02CF63A2"/>
+    <w:multiLevelType w:val="hybridMultilevel"/>
+    <w:tmpl w:val="7492AA36"/>
+    <w:lvl w:ilvl="0" w:tplc="1BA044B6">
+      <w:numFmt w:val="bullet"/>
+      <w:lvlText w:val=""/>
+      <w:lvlJc w:val="left"/>
+      <w:pPr>
+        <w:ind w:left="720" w:hanging="360"/>
+      </w:pPr>
+      <w:rPr>
+        <w:rFonts w:ascii="Symbol" w:eastAsia="Arial Unicode MS" w:hAnsi="Symbol" w:cs="Times New Roman" w:hint="default"/>
+      </w:rPr>
+    </w:lvl>
+    <w:lvl w:ilvl="1" w:tplc="04160003" w:tentative="1">
+      <w:start w:val="1"/>
+      <w:numFmt w:val="bullet"/>
+      <w:lvlText w:val="o"/>
+      <w:lvlJc w:val="left"/>
+      <w:pPr>
+        <w:ind w:left="1440" w:hanging="360"/>
+      </w:pPr>
+      <w:rPr>
+        <w:rFonts w:ascii="Courier New" w:hAnsi="Courier New" w:cs="Courier New" w:hint="default"/>
+      </w:rPr>
+    </w:lvl>
+    <w:lvl w:ilvl="2" w:tplc="04160005" w:tentative="1">
+      <w:start w:val="1"/>
+      <w:numFmt w:val="bullet"/>
+      <w:lvlText w:val=""/>
+      <w:lvlJc w:val="left"/>
+      <w:pPr>
+        <w:ind w:left="2160" w:hanging="360"/>
+      </w:pPr>
+      <w:rPr>
+        <w:rFonts w:ascii="Wingdings" w:hAnsi="Wingdings" w:hint="default"/>
+      </w:rPr>
+    </w:lvl>
+    <w:lvl w:ilvl="3" w:tplc="04160001" w:tentative="1">
+      <w:start w:val="1"/>
+      <w:numFmt w:val="bullet"/>
+      <w:lvlText w:val=""/>
+      <w:lvlJc w:val="left"/>
+      <w:pPr>
+        <w:ind w:left="2880" w:hanging="360"/>
+      </w:pPr>
+      <w:rPr>
+        <w:rFonts w:ascii="Symbol" w:hAnsi="Symbol" w:hint="default"/>
+      </w:rPr>
+    </w:lvl>
+    <w:lvl w:ilvl="4" w:tplc="04160003" w:tentative="1">
+      <w:start w:val="1"/>
+      <w:numFmt w:val="bullet"/>
+      <w:lvlText w:val="o"/>
+      <w:lvlJc w:val="left"/>
+      <w:pPr>
+        <w:ind w:left="3600" w:hanging="360"/>
+      </w:pPr>
+      <w:rPr>
+        <w:rFonts w:ascii="Courier New" w:hAnsi="Courier New" w:cs="Courier New" w:hint="default"/>
+      </w:rPr>
+    </w:lvl>
+    <w:lvl w:ilvl="5" w:tplc="04160005" w:tentative="1">
+      <w:start w:val="1"/>
+      <w:numFmt w:val="bullet"/>
+      <w:lvlText w:val=""/>
+      <w:lvlJc w:val="left"/>
+      <w:pPr>
+        <w:ind w:left="4320" w:hanging="360"/>
+      </w:pPr>
+      <w:rPr>
+        <w:rFonts w:ascii="Wingdings" w:hAnsi="Wingdings" w:hint="default"/>
+      </w:rPr>
+    </w:lvl>
+    <w:lvl w:ilvl="6" w:tplc="04160001" w:tentative="1">
+      <w:start w:val="1"/>
+      <w:numFmt w:val="bullet"/>
+      <w:lvlText w:val=""/>
+      <w:lvlJc w:val="left"/>
+      <w:pPr>
+        <w:ind w:left="5040" w:hanging="360"/>
+      </w:pPr>
+      <w:rPr>
+        <w:rFonts w:ascii="Symbol" w:hAnsi="Symbol" w:hint="default"/>
+      </w:rPr>
+    </w:lvl>
+    <w:lvl w:ilvl="7" w:tplc="04160003" w:tentative="1">
+      <w:start w:val="1"/>
+      <w:numFmt w:val="bullet"/>
+      <w:lvlText w:val="o"/>
+      <w:lvlJc w:val="left"/>
+      <w:pPr>
+        <w:ind w:left="5760" w:hanging="360"/>
+      </w:pPr>
+      <w:rPr>
+        <w:rFonts w:ascii="Courier New" w:hAnsi="Courier New" w:cs="Courier New" w:hint="default"/>
+      </w:rPr>
+    </w:lvl>
+    <w:lvl w:ilvl="8" w:tplc="04160005" w:tentative="1">
+      <w:start w:val="1"/>
+      <w:numFmt w:val="bullet"/>
+      <w:lvlText w:val=""/>
+      <w:lvlJc w:val="left"/>
+      <w:pPr>
+        <w:ind w:left="6480" w:hanging="360"/>
+      </w:pPr>
+      <w:rPr>
+        <w:rFonts w:ascii="Wingdings" w:hAnsi="Wingdings" w:hint="default"/>
+      </w:rPr>
+    </w:lvl>
+  </w:abstractNum>
+  <w:abstractNum w:abstractNumId="1" w15:restartNumberingAfterBreak="0">
     <w:nsid w:val="0A7F642C"/>
     <w:multiLevelType w:val="hybridMultilevel"/>
     <w:tmpl w:val="C6CC1F42"/>
@@ -5973,7 +7503,7 @@
       </w:rPr>
     </w:lvl>
   </w:abstractNum>
-  <w:abstractNum w:abstractNumId="1" w15:restartNumberingAfterBreak="0">
+  <w:abstractNum w:abstractNumId="2" w15:restartNumberingAfterBreak="0">
     <w:nsid w:val="0B5E3A5E"/>
     <w:multiLevelType w:val="multilevel"/>
     <w:tmpl w:val="F462DFD6"/>
@@ -6086,7 +7616,7 @@
       </w:rPr>
     </w:lvl>
   </w:abstractNum>
-  <w:abstractNum w:abstractNumId="2" w15:restartNumberingAfterBreak="0">
+  <w:abstractNum w:abstractNumId="3" w15:restartNumberingAfterBreak="0">
     <w:nsid w:val="10A4263D"/>
     <w:multiLevelType w:val="hybridMultilevel"/>
     <w:tmpl w:val="CF16147A"/>
@@ -6175,7 +7705,7 @@
       </w:pPr>
     </w:lvl>
   </w:abstractNum>
-  <w:abstractNum w:abstractNumId="3" w15:restartNumberingAfterBreak="0">
+  <w:abstractNum w:abstractNumId="4" w15:restartNumberingAfterBreak="0">
     <w:nsid w:val="12E6433A"/>
     <w:multiLevelType w:val="hybridMultilevel"/>
     <w:tmpl w:val="2040B3BA"/>
@@ -6264,7 +7794,7 @@
       </w:pPr>
     </w:lvl>
   </w:abstractNum>
-  <w:abstractNum w:abstractNumId="4" w15:restartNumberingAfterBreak="0">
+  <w:abstractNum w:abstractNumId="5" w15:restartNumberingAfterBreak="0">
     <w:nsid w:val="25A60AEA"/>
     <w:multiLevelType w:val="hybridMultilevel"/>
     <w:tmpl w:val="CF16147A"/>
@@ -6353,7 +7883,7 @@
       </w:pPr>
     </w:lvl>
   </w:abstractNum>
-  <w:abstractNum w:abstractNumId="5" w15:restartNumberingAfterBreak="0">
+  <w:abstractNum w:abstractNumId="6" w15:restartNumberingAfterBreak="0">
     <w:nsid w:val="2EEC542D"/>
     <w:multiLevelType w:val="hybridMultilevel"/>
     <w:tmpl w:val="78C20D46"/>
@@ -6466,7 +7996,7 @@
       </w:rPr>
     </w:lvl>
   </w:abstractNum>
-  <w:abstractNum w:abstractNumId="6" w15:restartNumberingAfterBreak="0">
+  <w:abstractNum w:abstractNumId="7" w15:restartNumberingAfterBreak="0">
     <w:nsid w:val="34BF3F9E"/>
     <w:multiLevelType w:val="hybridMultilevel"/>
     <w:tmpl w:val="54D4B2AE"/>
@@ -6555,7 +8085,7 @@
       </w:pPr>
     </w:lvl>
   </w:abstractNum>
-  <w:abstractNum w:abstractNumId="7" w15:restartNumberingAfterBreak="0">
+  <w:abstractNum w:abstractNumId="8" w15:restartNumberingAfterBreak="0">
     <w:nsid w:val="35135252"/>
     <w:multiLevelType w:val="hybridMultilevel"/>
     <w:tmpl w:val="BB0C7432"/>
@@ -6668,7 +8198,7 @@
       </w:rPr>
     </w:lvl>
   </w:abstractNum>
-  <w:abstractNum w:abstractNumId="8" w15:restartNumberingAfterBreak="0">
+  <w:abstractNum w:abstractNumId="9" w15:restartNumberingAfterBreak="0">
     <w:nsid w:val="3A8F4B40"/>
     <w:multiLevelType w:val="multilevel"/>
     <w:tmpl w:val="1FA0BD0A"/>
@@ -6789,7 +8319,7 @@
       </w:rPr>
     </w:lvl>
   </w:abstractNum>
-  <w:abstractNum w:abstractNumId="9" w15:restartNumberingAfterBreak="0">
+  <w:abstractNum w:abstractNumId="10" w15:restartNumberingAfterBreak="0">
     <w:nsid w:val="3EB97359"/>
     <w:multiLevelType w:val="hybridMultilevel"/>
     <w:tmpl w:val="C7F802C6"/>
@@ -6902,7 +8432,7 @@
       </w:rPr>
     </w:lvl>
   </w:abstractNum>
-  <w:abstractNum w:abstractNumId="10" w15:restartNumberingAfterBreak="0">
+  <w:abstractNum w:abstractNumId="11" w15:restartNumberingAfterBreak="0">
     <w:nsid w:val="4B984B9E"/>
     <w:multiLevelType w:val="multilevel"/>
     <w:tmpl w:val="464EA376"/>
@@ -7023,7 +8553,7 @@
       </w:rPr>
     </w:lvl>
   </w:abstractNum>
-  <w:abstractNum w:abstractNumId="11" w15:restartNumberingAfterBreak="0">
+  <w:abstractNum w:abstractNumId="12" w15:restartNumberingAfterBreak="0">
     <w:nsid w:val="4FBE03C4"/>
     <w:multiLevelType w:val="multilevel"/>
     <w:tmpl w:val="0390FE80"/>
@@ -7146,7 +8676,7 @@
       </w:rPr>
     </w:lvl>
   </w:abstractNum>
-  <w:abstractNum w:abstractNumId="12" w15:restartNumberingAfterBreak="0">
+  <w:abstractNum w:abstractNumId="13" w15:restartNumberingAfterBreak="0">
     <w:nsid w:val="50FC184C"/>
     <w:multiLevelType w:val="multilevel"/>
     <w:tmpl w:val="51D6DD0C"/>
@@ -7267,7 +8797,7 @@
       </w:rPr>
     </w:lvl>
   </w:abstractNum>
-  <w:abstractNum w:abstractNumId="13" w15:restartNumberingAfterBreak="0">
+  <w:abstractNum w:abstractNumId="14" w15:restartNumberingAfterBreak="0">
     <w:nsid w:val="54B55DAC"/>
     <w:multiLevelType w:val="multilevel"/>
     <w:tmpl w:val="D5F0D33E"/>
@@ -7380,7 +8910,7 @@
       </w:rPr>
     </w:lvl>
   </w:abstractNum>
-  <w:abstractNum w:abstractNumId="14" w15:restartNumberingAfterBreak="0">
+  <w:abstractNum w:abstractNumId="15" w15:restartNumberingAfterBreak="0">
     <w:nsid w:val="591C4107"/>
     <w:multiLevelType w:val="multilevel"/>
     <w:tmpl w:val="464EA376"/>
@@ -7501,7 +9031,7 @@
       </w:rPr>
     </w:lvl>
   </w:abstractNum>
-  <w:abstractNum w:abstractNumId="15" w15:restartNumberingAfterBreak="0">
+  <w:abstractNum w:abstractNumId="16" w15:restartNumberingAfterBreak="0">
     <w:nsid w:val="5AF2482D"/>
     <w:multiLevelType w:val="hybridMultilevel"/>
     <w:tmpl w:val="0908C13E"/>
@@ -7614,7 +9144,7 @@
       </w:rPr>
     </w:lvl>
   </w:abstractNum>
-  <w:abstractNum w:abstractNumId="16" w15:restartNumberingAfterBreak="0">
+  <w:abstractNum w:abstractNumId="17" w15:restartNumberingAfterBreak="0">
     <w:nsid w:val="5ECC0B5B"/>
     <w:multiLevelType w:val="hybridMultilevel"/>
     <w:tmpl w:val="876A701C"/>
@@ -7727,7 +9257,7 @@
       </w:rPr>
     </w:lvl>
   </w:abstractNum>
-  <w:abstractNum w:abstractNumId="17" w15:restartNumberingAfterBreak="0">
+  <w:abstractNum w:abstractNumId="18" w15:restartNumberingAfterBreak="0">
     <w:nsid w:val="61705F17"/>
     <w:multiLevelType w:val="hybridMultilevel"/>
     <w:tmpl w:val="75083632"/>
@@ -7840,7 +9370,7 @@
       </w:rPr>
     </w:lvl>
   </w:abstractNum>
-  <w:abstractNum w:abstractNumId="18" w15:restartNumberingAfterBreak="0">
+  <w:abstractNum w:abstractNumId="19" w15:restartNumberingAfterBreak="0">
     <w:nsid w:val="63F33112"/>
     <w:multiLevelType w:val="hybridMultilevel"/>
     <w:tmpl w:val="F796F522"/>
@@ -7929,7 +9459,7 @@
       </w:pPr>
     </w:lvl>
   </w:abstractNum>
-  <w:abstractNum w:abstractNumId="19" w15:restartNumberingAfterBreak="0">
+  <w:abstractNum w:abstractNumId="20" w15:restartNumberingAfterBreak="0">
     <w:nsid w:val="78680DCB"/>
     <w:multiLevelType w:val="multilevel"/>
     <w:tmpl w:val="C9C2A5CC"/>
@@ -8050,7 +9580,7 @@
       </w:rPr>
     </w:lvl>
   </w:abstractNum>
-  <w:abstractNum w:abstractNumId="20" w15:restartNumberingAfterBreak="0">
+  <w:abstractNum w:abstractNumId="21" w15:restartNumberingAfterBreak="0">
     <w:nsid w:val="78AA6A1D"/>
     <w:multiLevelType w:val="multilevel"/>
     <w:tmpl w:val="F462DFD6"/>
@@ -8163,7 +9693,7 @@
       </w:rPr>
     </w:lvl>
   </w:abstractNum>
-  <w:abstractNum w:abstractNumId="21" w15:restartNumberingAfterBreak="0">
+  <w:abstractNum w:abstractNumId="22" w15:restartNumberingAfterBreak="0">
     <w:nsid w:val="7F4E1EDE"/>
     <w:multiLevelType w:val="hybridMultilevel"/>
     <w:tmpl w:val="C0BEC260"/>
@@ -8253,70 +9783,73 @@
     </w:lvl>
   </w:abstractNum>
   <w:num w:numId="1">
+    <w:abstractNumId w:val="12"/>
+  </w:num>
+  <w:num w:numId="2">
+    <w:abstractNumId w:val="17"/>
+  </w:num>
+  <w:num w:numId="3">
+    <w:abstractNumId w:val="16"/>
+  </w:num>
+  <w:num w:numId="4">
+    <w:abstractNumId w:val="18"/>
+  </w:num>
+  <w:num w:numId="5">
+    <w:abstractNumId w:val="6"/>
+  </w:num>
+  <w:num w:numId="6">
+    <w:abstractNumId w:val="8"/>
+  </w:num>
+  <w:num w:numId="7">
+    <w:abstractNumId w:val="15"/>
+  </w:num>
+  <w:num w:numId="8">
+    <w:abstractNumId w:val="14"/>
+  </w:num>
+  <w:num w:numId="9">
+    <w:abstractNumId w:val="7"/>
+  </w:num>
+  <w:num w:numId="10">
+    <w:abstractNumId w:val="2"/>
+  </w:num>
+  <w:num w:numId="11">
+    <w:abstractNumId w:val="21"/>
+  </w:num>
+  <w:num w:numId="12">
+    <w:abstractNumId w:val="22"/>
+  </w:num>
+  <w:num w:numId="13">
     <w:abstractNumId w:val="11"/>
   </w:num>
-  <w:num w:numId="2">
-    <w:abstractNumId w:val="16"/>
+  <w:num w:numId="14">
+    <w:abstractNumId w:val="9"/>
   </w:num>
-  <w:num w:numId="3">
-    <w:abstractNumId w:val="15"/>
+  <w:num w:numId="15">
+    <w:abstractNumId w:val="20"/>
   </w:num>
-  <w:num w:numId="4">
-    <w:abstractNumId w:val="17"/>
+  <w:num w:numId="16">
+    <w:abstractNumId w:val="1"/>
   </w:num>
-  <w:num w:numId="5">
+  <w:num w:numId="17">
+    <w:abstractNumId w:val="13"/>
+  </w:num>
+  <w:num w:numId="18">
+    <w:abstractNumId w:val="3"/>
+  </w:num>
+  <w:num w:numId="19">
     <w:abstractNumId w:val="5"/>
   </w:num>
-  <w:num w:numId="6">
-    <w:abstractNumId w:val="7"/>
+  <w:num w:numId="20">
+    <w:abstractNumId w:val="4"/>
   </w:num>
-  <w:num w:numId="7">
-    <w:abstractNumId w:val="14"/>
+  <w:num w:numId="21">
+    <w:abstractNumId w:val="19"/>
   </w:num>
-  <w:num w:numId="8">
-    <w:abstractNumId w:val="13"/>
-  </w:num>
-  <w:num w:numId="9">
-    <w:abstractNumId w:val="6"/>
-  </w:num>
-  <w:num w:numId="10">
-    <w:abstractNumId w:val="1"/>
-  </w:num>
-  <w:num w:numId="11">
-    <w:abstractNumId w:val="20"/>
-  </w:num>
-  <w:num w:numId="12">
-    <w:abstractNumId w:val="21"/>
-  </w:num>
-  <w:num w:numId="13">
+  <w:num w:numId="22">
     <w:abstractNumId w:val="10"/>
   </w:num>
-  <w:num w:numId="14">
-    <w:abstractNumId w:val="8"/>
-  </w:num>
-  <w:num w:numId="15">
-    <w:abstractNumId w:val="19"/>
-  </w:num>
-  <w:num w:numId="16">
+  <w:num w:numId="23">
     <w:abstractNumId w:val="0"/>
-  </w:num>
-  <w:num w:numId="17">
-    <w:abstractNumId w:val="12"/>
-  </w:num>
-  <w:num w:numId="18">
-    <w:abstractNumId w:val="2"/>
-  </w:num>
-  <w:num w:numId="19">
-    <w:abstractNumId w:val="4"/>
-  </w:num>
-  <w:num w:numId="20">
-    <w:abstractNumId w:val="3"/>
-  </w:num>
-  <w:num w:numId="21">
-    <w:abstractNumId w:val="18"/>
-  </w:num>
-  <w:num w:numId="22">
-    <w:abstractNumId w:val="9"/>
   </w:num>
 </w:numbering>
 </file>

</xml_diff>